<commit_message>
fix: isActive e isLogIn como signals + capturas de la app
Al capturar las pantallas se detecto que la sesion se guardaba pero al
reabrir la aplicacion volvia a pedir credenciales. La causa no estaba en la
capa de persistencia: Tab1Page mantenia isActive como propiedad normal, y
como la aplicacion es zoneless, Angular no repinta la vista cuando el valor
cambia despues de un await. Se convirtieron isActive e isLogIn en signals,
que es lo que ya usaba el resto del componente.

Se agregan ademas 9 capturas de la aplicacion en ejecucion (alta, edicion,
favorita, eliminacion, reinicio, sesion restaurada y lista sin conexion) y
se insertan en el documento de la entrega.
</commit_message>
<xml_diff>
--- a/docs/Entrega3-Persistencia.docx
+++ b/docs/Entrega3-Persistencia.docx
@@ -11,7 +11,7 @@
           <w:noProof/>
         </w:rPr>
         <w:drawing>
-          <wp:inline distT="0" distB="0" distL="0" distR="0" wp14:anchorId="434265C9" wp14:editId="6547B6F8">
+          <wp:inline distT="0" distB="0" distL="0" distR="0" wp14:anchorId="32E079D4" wp14:editId="68AE87B7">
             <wp:extent cx="2377440" cy="1095851"/>
             <wp:effectExtent l="0" t="0" r="0" b="0"/>
             <wp:docPr id="1" name="Picture 1"/>
@@ -107,7 +107,7 @@
           <w:noProof/>
         </w:rPr>
         <w:drawing>
-          <wp:inline distT="0" distB="0" distL="0" distR="0" wp14:anchorId="0B4337F7" wp14:editId="2CC6B97A">
+          <wp:inline distT="0" distB="0" distL="0" distR="0" wp14:anchorId="0A995F2F" wp14:editId="38E55089">
             <wp:extent cx="4572000" cy="1143000"/>
             <wp:effectExtent l="0" t="0" r="0" b="0"/>
             <wp:docPr id="2" name="Picture 2"/>
@@ -368,7 +368,7 @@
       <w:r>
         <w:fldChar w:fldCharType="separate"/>
       </w:r>
-      <w:hyperlink w:anchor="_Toc240928917" w:history="1">
+      <w:hyperlink w:anchor="_Toc240929533" w:history="1">
         <w:r>
           <w:rPr>
             <w:rStyle w:val="Hipervnculo"/>
@@ -395,7 +395,7 @@
             <w:noProof/>
             <w:webHidden/>
           </w:rPr>
-          <w:instrText xml:space="preserve"> PAGEREF _Toc240928917 \h </w:instrText>
+          <w:instrText xml:space="preserve"> PAGEREF _Toc240929533 \h </w:instrText>
         </w:r>
         <w:r>
           <w:rPr>
@@ -415,7 +415,7 @@
             <w:noProof/>
             <w:webHidden/>
           </w:rPr>
-          <w:t>3</w:t>
+          <w:t>4</w:t>
         </w:r>
         <w:r>
           <w:rPr>
@@ -442,7 +442,7 @@
           <w14:ligatures w14:val="standardContextual"/>
         </w:rPr>
       </w:pPr>
-      <w:hyperlink w:anchor="_Toc240928918" w:history="1">
+      <w:hyperlink w:anchor="_Toc240929534" w:history="1">
         <w:r>
           <w:rPr>
             <w:rStyle w:val="Hipervnculo"/>
@@ -469,7 +469,7 @@
             <w:noProof/>
             <w:webHidden/>
           </w:rPr>
-          <w:instrText xml:space="preserve"> PAGEREF _Toc240928918 \h </w:instrText>
+          <w:instrText xml:space="preserve"> PAGEREF _Toc240929534 \h </w:instrText>
         </w:r>
         <w:r>
           <w:rPr>
@@ -489,7 +489,7 @@
             <w:noProof/>
             <w:webHidden/>
           </w:rPr>
-          <w:t>3</w:t>
+          <w:t>4</w:t>
         </w:r>
         <w:r>
           <w:rPr>
@@ -516,7 +516,7 @@
           <w14:ligatures w14:val="standardContextual"/>
         </w:rPr>
       </w:pPr>
-      <w:hyperlink w:anchor="_Toc240928919" w:history="1">
+      <w:hyperlink w:anchor="_Toc240929535" w:history="1">
         <w:r>
           <w:rPr>
             <w:rStyle w:val="Hipervnculo"/>
@@ -543,7 +543,7 @@
             <w:noProof/>
             <w:webHidden/>
           </w:rPr>
-          <w:instrText xml:space="preserve"> PAGEREF _Toc240928919 \h </w:instrText>
+          <w:instrText xml:space="preserve"> PAGEREF _Toc240929535 \h </w:instrText>
         </w:r>
         <w:r>
           <w:rPr>
@@ -563,7 +563,7 @@
             <w:noProof/>
             <w:webHidden/>
           </w:rPr>
-          <w:t>3</w:t>
+          <w:t>4</w:t>
         </w:r>
         <w:r>
           <w:rPr>
@@ -590,7 +590,7 @@
           <w14:ligatures w14:val="standardContextual"/>
         </w:rPr>
       </w:pPr>
-      <w:hyperlink w:anchor="_Toc240928920" w:history="1">
+      <w:hyperlink w:anchor="_Toc240929536" w:history="1">
         <w:r>
           <w:rPr>
             <w:rStyle w:val="Hipervnculo"/>
@@ -617,7 +617,7 @@
             <w:noProof/>
             <w:webHidden/>
           </w:rPr>
-          <w:instrText xml:space="preserve"> PAGEREF _Toc240928920 \h </w:instrText>
+          <w:instrText xml:space="preserve"> PAGEREF _Toc240929536 \h </w:instrText>
         </w:r>
         <w:r>
           <w:rPr>
@@ -637,7 +637,7 @@
             <w:noProof/>
             <w:webHidden/>
           </w:rPr>
-          <w:t>4</w:t>
+          <w:t>5</w:t>
         </w:r>
         <w:r>
           <w:rPr>
@@ -664,7 +664,7 @@
           <w14:ligatures w14:val="standardContextual"/>
         </w:rPr>
       </w:pPr>
-      <w:hyperlink w:anchor="_Toc240928921" w:history="1">
+      <w:hyperlink w:anchor="_Toc240929537" w:history="1">
         <w:r>
           <w:rPr>
             <w:rStyle w:val="Hipervnculo"/>
@@ -691,7 +691,7 @@
             <w:noProof/>
             <w:webHidden/>
           </w:rPr>
-          <w:instrText xml:space="preserve"> PAGEREF _Toc240928921 \h </w:instrText>
+          <w:instrText xml:space="preserve"> PAGEREF _Toc240929537 \h </w:instrText>
         </w:r>
         <w:r>
           <w:rPr>
@@ -711,7 +711,7 @@
             <w:noProof/>
             <w:webHidden/>
           </w:rPr>
-          <w:t>4</w:t>
+          <w:t>5</w:t>
         </w:r>
         <w:r>
           <w:rPr>
@@ -738,7 +738,7 @@
           <w14:ligatures w14:val="standardContextual"/>
         </w:rPr>
       </w:pPr>
-      <w:hyperlink w:anchor="_Toc240928922" w:history="1">
+      <w:hyperlink w:anchor="_Toc240929538" w:history="1">
         <w:r>
           <w:rPr>
             <w:rStyle w:val="Hipervnculo"/>
@@ -765,7 +765,7 @@
             <w:noProof/>
             <w:webHidden/>
           </w:rPr>
-          <w:instrText xml:space="preserve"> PAGEREF _Toc240928922 \h </w:instrText>
+          <w:instrText xml:space="preserve"> PAGEREF _Toc240929538 \h </w:instrText>
         </w:r>
         <w:r>
           <w:rPr>
@@ -785,7 +785,7 @@
             <w:noProof/>
             <w:webHidden/>
           </w:rPr>
-          <w:t>5</w:t>
+          <w:t>6</w:t>
         </w:r>
         <w:r>
           <w:rPr>
@@ -812,7 +812,7 @@
           <w14:ligatures w14:val="standardContextual"/>
         </w:rPr>
       </w:pPr>
-      <w:hyperlink w:anchor="_Toc240928923" w:history="1">
+      <w:hyperlink w:anchor="_Toc240929539" w:history="1">
         <w:r>
           <w:rPr>
             <w:rStyle w:val="Hipervnculo"/>
@@ -839,7 +839,7 @@
             <w:noProof/>
             <w:webHidden/>
           </w:rPr>
-          <w:instrText xml:space="preserve"> PAGEREF _Toc240928923 \h </w:instrText>
+          <w:instrText xml:space="preserve"> PAGEREF _Toc240929539 \h </w:instrText>
         </w:r>
         <w:r>
           <w:rPr>
@@ -859,7 +859,7 @@
             <w:noProof/>
             <w:webHidden/>
           </w:rPr>
-          <w:t>5</w:t>
+          <w:t>6</w:t>
         </w:r>
         <w:r>
           <w:rPr>
@@ -886,7 +886,7 @@
           <w14:ligatures w14:val="standardContextual"/>
         </w:rPr>
       </w:pPr>
-      <w:hyperlink w:anchor="_Toc240928924" w:history="1">
+      <w:hyperlink w:anchor="_Toc240929540" w:history="1">
         <w:r>
           <w:rPr>
             <w:rStyle w:val="Hipervnculo"/>
@@ -913,7 +913,7 @@
             <w:noProof/>
             <w:webHidden/>
           </w:rPr>
-          <w:instrText xml:space="preserve"> PAGEREF _Toc240928924 \h </w:instrText>
+          <w:instrText xml:space="preserve"> PAGEREF _Toc240929540 \h </w:instrText>
         </w:r>
         <w:r>
           <w:rPr>
@@ -933,7 +933,7 @@
             <w:noProof/>
             <w:webHidden/>
           </w:rPr>
-          <w:t>5</w:t>
+          <w:t>6</w:t>
         </w:r>
         <w:r>
           <w:rPr>
@@ -960,7 +960,7 @@
           <w14:ligatures w14:val="standardContextual"/>
         </w:rPr>
       </w:pPr>
-      <w:hyperlink w:anchor="_Toc240928925" w:history="1">
+      <w:hyperlink w:anchor="_Toc240929541" w:history="1">
         <w:r>
           <w:rPr>
             <w:rStyle w:val="Hipervnculo"/>
@@ -987,7 +987,7 @@
             <w:noProof/>
             <w:webHidden/>
           </w:rPr>
-          <w:instrText xml:space="preserve"> PAGEREF _Toc240928925 \h </w:instrText>
+          <w:instrText xml:space="preserve"> PAGEREF _Toc240929541 \h </w:instrText>
         </w:r>
         <w:r>
           <w:rPr>
@@ -1007,7 +1007,7 @@
             <w:noProof/>
             <w:webHidden/>
           </w:rPr>
-          <w:t>6</w:t>
+          <w:t>7</w:t>
         </w:r>
         <w:r>
           <w:rPr>
@@ -1034,7 +1034,7 @@
           <w14:ligatures w14:val="standardContextual"/>
         </w:rPr>
       </w:pPr>
-      <w:hyperlink w:anchor="_Toc240928926" w:history="1">
+      <w:hyperlink w:anchor="_Toc240929542" w:history="1">
         <w:r>
           <w:rPr>
             <w:rStyle w:val="Hipervnculo"/>
@@ -1061,7 +1061,7 @@
             <w:noProof/>
             <w:webHidden/>
           </w:rPr>
-          <w:instrText xml:space="preserve"> PAGEREF _Toc240928926 \h </w:instrText>
+          <w:instrText xml:space="preserve"> PAGEREF _Toc240929542 \h </w:instrText>
         </w:r>
         <w:r>
           <w:rPr>
@@ -1081,7 +1081,7 @@
             <w:noProof/>
             <w:webHidden/>
           </w:rPr>
-          <w:t>6</w:t>
+          <w:t>7</w:t>
         </w:r>
         <w:r>
           <w:rPr>
@@ -1108,7 +1108,7 @@
           <w14:ligatures w14:val="standardContextual"/>
         </w:rPr>
       </w:pPr>
-      <w:hyperlink w:anchor="_Toc240928927" w:history="1">
+      <w:hyperlink w:anchor="_Toc240929543" w:history="1">
         <w:r>
           <w:rPr>
             <w:rStyle w:val="Hipervnculo"/>
@@ -1135,7 +1135,7 @@
             <w:noProof/>
             <w:webHidden/>
           </w:rPr>
-          <w:instrText xml:space="preserve"> PAGEREF _Toc240928927 \h </w:instrText>
+          <w:instrText xml:space="preserve"> PAGEREF _Toc240929543 \h </w:instrText>
         </w:r>
         <w:r>
           <w:rPr>
@@ -1155,7 +1155,7 @@
             <w:noProof/>
             <w:webHidden/>
           </w:rPr>
-          <w:t>7</w:t>
+          <w:t>8</w:t>
         </w:r>
         <w:r>
           <w:rPr>
@@ -1182,7 +1182,7 @@
           <w14:ligatures w14:val="standardContextual"/>
         </w:rPr>
       </w:pPr>
-      <w:hyperlink w:anchor="_Toc240928928" w:history="1">
+      <w:hyperlink w:anchor="_Toc240929544" w:history="1">
         <w:r>
           <w:rPr>
             <w:rStyle w:val="Hipervnculo"/>
@@ -1209,7 +1209,7 @@
             <w:noProof/>
             <w:webHidden/>
           </w:rPr>
-          <w:instrText xml:space="preserve"> PAGEREF _Toc240928928 \h </w:instrText>
+          <w:instrText xml:space="preserve"> PAGEREF _Toc240929544 \h </w:instrText>
         </w:r>
         <w:r>
           <w:rPr>
@@ -1229,7 +1229,7 @@
             <w:noProof/>
             <w:webHidden/>
           </w:rPr>
-          <w:t>7</w:t>
+          <w:t>8</w:t>
         </w:r>
         <w:r>
           <w:rPr>
@@ -1256,7 +1256,7 @@
           <w14:ligatures w14:val="standardContextual"/>
         </w:rPr>
       </w:pPr>
-      <w:hyperlink w:anchor="_Toc240928929" w:history="1">
+      <w:hyperlink w:anchor="_Toc240929545" w:history="1">
         <w:r>
           <w:rPr>
             <w:rStyle w:val="Hipervnculo"/>
@@ -1283,7 +1283,7 @@
             <w:noProof/>
             <w:webHidden/>
           </w:rPr>
-          <w:instrText xml:space="preserve"> PAGEREF _Toc240928929 \h </w:instrText>
+          <w:instrText xml:space="preserve"> PAGEREF _Toc240929545 \h </w:instrText>
         </w:r>
         <w:r>
           <w:rPr>
@@ -1303,7 +1303,7 @@
             <w:noProof/>
             <w:webHidden/>
           </w:rPr>
-          <w:t>8</w:t>
+          <w:t>9</w:t>
         </w:r>
         <w:r>
           <w:rPr>
@@ -1330,7 +1330,7 @@
           <w14:ligatures w14:val="standardContextual"/>
         </w:rPr>
       </w:pPr>
-      <w:hyperlink w:anchor="_Toc240928930" w:history="1">
+      <w:hyperlink w:anchor="_Toc240929546" w:history="1">
         <w:r>
           <w:rPr>
             <w:rStyle w:val="Hipervnculo"/>
@@ -1357,7 +1357,7 @@
             <w:noProof/>
             <w:webHidden/>
           </w:rPr>
-          <w:instrText xml:space="preserve"> PAGEREF _Toc240928930 \h </w:instrText>
+          <w:instrText xml:space="preserve"> PAGEREF _Toc240929546 \h </w:instrText>
         </w:r>
         <w:r>
           <w:rPr>
@@ -1377,7 +1377,7 @@
             <w:noProof/>
             <w:webHidden/>
           </w:rPr>
-          <w:t>8</w:t>
+          <w:t>9</w:t>
         </w:r>
         <w:r>
           <w:rPr>
@@ -1404,7 +1404,7 @@
           <w14:ligatures w14:val="standardContextual"/>
         </w:rPr>
       </w:pPr>
-      <w:hyperlink w:anchor="_Toc240928931" w:history="1">
+      <w:hyperlink w:anchor="_Toc240929547" w:history="1">
         <w:r>
           <w:rPr>
             <w:rStyle w:val="Hipervnculo"/>
@@ -1431,7 +1431,7 @@
             <w:noProof/>
             <w:webHidden/>
           </w:rPr>
-          <w:instrText xml:space="preserve"> PAGEREF _Toc240928931 \h </w:instrText>
+          <w:instrText xml:space="preserve"> PAGEREF _Toc240929547 \h </w:instrText>
         </w:r>
         <w:r>
           <w:rPr>
@@ -1451,7 +1451,7 @@
             <w:noProof/>
             <w:webHidden/>
           </w:rPr>
-          <w:t>9</w:t>
+          <w:t>10</w:t>
         </w:r>
         <w:r>
           <w:rPr>
@@ -1478,7 +1478,7 @@
           <w14:ligatures w14:val="standardContextual"/>
         </w:rPr>
       </w:pPr>
-      <w:hyperlink w:anchor="_Toc240928932" w:history="1">
+      <w:hyperlink w:anchor="_Toc240929548" w:history="1">
         <w:r>
           <w:rPr>
             <w:rStyle w:val="Hipervnculo"/>
@@ -1505,7 +1505,7 @@
             <w:noProof/>
             <w:webHidden/>
           </w:rPr>
-          <w:instrText xml:space="preserve"> PAGEREF _Toc240928932 \h </w:instrText>
+          <w:instrText xml:space="preserve"> PAGEREF _Toc240929548 \h </w:instrText>
         </w:r>
         <w:r>
           <w:rPr>
@@ -1525,7 +1525,7 @@
             <w:noProof/>
             <w:webHidden/>
           </w:rPr>
-          <w:t>9</w:t>
+          <w:t>10</w:t>
         </w:r>
         <w:r>
           <w:rPr>
@@ -1552,7 +1552,7 @@
           <w14:ligatures w14:val="standardContextual"/>
         </w:rPr>
       </w:pPr>
-      <w:hyperlink w:anchor="_Toc240928933" w:history="1">
+      <w:hyperlink w:anchor="_Toc240929549" w:history="1">
         <w:r>
           <w:rPr>
             <w:rStyle w:val="Hipervnculo"/>
@@ -1579,7 +1579,7 @@
             <w:noProof/>
             <w:webHidden/>
           </w:rPr>
-          <w:instrText xml:space="preserve"> PAGEREF _Toc240928933 \h </w:instrText>
+          <w:instrText xml:space="preserve"> PAGEREF _Toc240929549 \h </w:instrText>
         </w:r>
         <w:r>
           <w:rPr>
@@ -1599,7 +1599,7 @@
             <w:noProof/>
             <w:webHidden/>
           </w:rPr>
-          <w:t>9</w:t>
+          <w:t>10</w:t>
         </w:r>
         <w:r>
           <w:rPr>
@@ -1626,13 +1626,13 @@
           <w14:ligatures w14:val="standardContextual"/>
         </w:rPr>
       </w:pPr>
-      <w:hyperlink w:anchor="_Toc240928934" w:history="1">
+      <w:hyperlink w:anchor="_Toc240929550" w:history="1">
         <w:r>
           <w:rPr>
             <w:rStyle w:val="Hipervnculo"/>
             <w:noProof/>
           </w:rPr>
-          <w:t>Technical Verification</w:t>
+          <w:t>Screenshots of the Running Application</w:t>
         </w:r>
         <w:r>
           <w:rPr>
@@ -1653,7 +1653,7 @@
             <w:noProof/>
             <w:webHidden/>
           </w:rPr>
-          <w:instrText xml:space="preserve"> PAGEREF _Toc240928934 \h </w:instrText>
+          <w:instrText xml:space="preserve"> PAGEREF _Toc240929550 \h </w:instrText>
         </w:r>
         <w:r>
           <w:rPr>
@@ -1673,7 +1673,303 @@
             <w:noProof/>
             <w:webHidden/>
           </w:rPr>
-          <w:t>9</w:t>
+          <w:t>10</w:t>
+        </w:r>
+        <w:r>
+          <w:rPr>
+            <w:noProof/>
+            <w:webHidden/>
+          </w:rPr>
+          <w:fldChar w:fldCharType="end"/>
+        </w:r>
+      </w:hyperlink>
+    </w:p>
+    <w:p>
+      <w:pPr>
+        <w:pStyle w:val="TDC2"/>
+        <w:tabs>
+          <w:tab w:val="right" w:leader="dot" w:pos="9350"/>
+        </w:tabs>
+        <w:rPr>
+          <w:rFonts w:asciiTheme="minorHAnsi" w:eastAsiaTheme="minorEastAsia" w:hAnsiTheme="minorHAnsi"/>
+          <w:noProof/>
+          <w:kern w:val="2"/>
+          <w:sz w:val="24"/>
+          <w:szCs w:val="24"/>
+          <w:lang w:val="es-MX" w:eastAsia="es-MX"/>
+          <w14:ligatures w14:val="standardContextual"/>
+        </w:rPr>
+      </w:pPr>
+      <w:hyperlink w:anchor="_Toc240929551" w:history="1">
+        <w:r>
+          <w:rPr>
+            <w:rStyle w:val="Hipervnculo"/>
+            <w:noProof/>
+          </w:rPr>
+          <w:t>Local notes: the full CRUD</w:t>
+        </w:r>
+        <w:r>
+          <w:rPr>
+            <w:noProof/>
+            <w:webHidden/>
+          </w:rPr>
+          <w:tab/>
+        </w:r>
+        <w:r>
+          <w:rPr>
+            <w:noProof/>
+            <w:webHidden/>
+          </w:rPr>
+          <w:fldChar w:fldCharType="begin"/>
+        </w:r>
+        <w:r>
+          <w:rPr>
+            <w:noProof/>
+            <w:webHidden/>
+          </w:rPr>
+          <w:instrText xml:space="preserve"> PAGEREF _Toc240929551 \h </w:instrText>
+        </w:r>
+        <w:r>
+          <w:rPr>
+            <w:noProof/>
+            <w:webHidden/>
+          </w:rPr>
+        </w:r>
+        <w:r>
+          <w:rPr>
+            <w:noProof/>
+            <w:webHidden/>
+          </w:rPr>
+          <w:fldChar w:fldCharType="separate"/>
+        </w:r>
+        <w:r>
+          <w:rPr>
+            <w:noProof/>
+            <w:webHidden/>
+          </w:rPr>
+          <w:t>10</w:t>
+        </w:r>
+        <w:r>
+          <w:rPr>
+            <w:noProof/>
+            <w:webHidden/>
+          </w:rPr>
+          <w:fldChar w:fldCharType="end"/>
+        </w:r>
+      </w:hyperlink>
+    </w:p>
+    <w:p>
+      <w:pPr>
+        <w:pStyle w:val="TDC2"/>
+        <w:tabs>
+          <w:tab w:val="right" w:leader="dot" w:pos="9350"/>
+        </w:tabs>
+        <w:rPr>
+          <w:rFonts w:asciiTheme="minorHAnsi" w:eastAsiaTheme="minorEastAsia" w:hAnsiTheme="minorHAnsi"/>
+          <w:noProof/>
+          <w:kern w:val="2"/>
+          <w:sz w:val="24"/>
+          <w:szCs w:val="24"/>
+          <w:lang w:val="es-MX" w:eastAsia="es-MX"/>
+          <w14:ligatures w14:val="standardContextual"/>
+        </w:rPr>
+      </w:pPr>
+      <w:hyperlink w:anchor="_Toc240929552" w:history="1">
+        <w:r>
+          <w:rPr>
+            <w:rStyle w:val="Hipervnculo"/>
+            <w:noProof/>
+          </w:rPr>
+          <w:t>The proof: the data survives a restart</w:t>
+        </w:r>
+        <w:r>
+          <w:rPr>
+            <w:noProof/>
+            <w:webHidden/>
+          </w:rPr>
+          <w:tab/>
+        </w:r>
+        <w:r>
+          <w:rPr>
+            <w:noProof/>
+            <w:webHidden/>
+          </w:rPr>
+          <w:fldChar w:fldCharType="begin"/>
+        </w:r>
+        <w:r>
+          <w:rPr>
+            <w:noProof/>
+            <w:webHidden/>
+          </w:rPr>
+          <w:instrText xml:space="preserve"> PAGEREF _Toc240929552 \h </w:instrText>
+        </w:r>
+        <w:r>
+          <w:rPr>
+            <w:noProof/>
+            <w:webHidden/>
+          </w:rPr>
+        </w:r>
+        <w:r>
+          <w:rPr>
+            <w:noProof/>
+            <w:webHidden/>
+          </w:rPr>
+          <w:fldChar w:fldCharType="separate"/>
+        </w:r>
+        <w:r>
+          <w:rPr>
+            <w:noProof/>
+            <w:webHidden/>
+          </w:rPr>
+          <w:t>12</w:t>
+        </w:r>
+        <w:r>
+          <w:rPr>
+            <w:noProof/>
+            <w:webHidden/>
+          </w:rPr>
+          <w:fldChar w:fldCharType="end"/>
+        </w:r>
+      </w:hyperlink>
+    </w:p>
+    <w:p>
+      <w:pPr>
+        <w:pStyle w:val="TDC2"/>
+        <w:tabs>
+          <w:tab w:val="right" w:leader="dot" w:pos="9350"/>
+        </w:tabs>
+        <w:rPr>
+          <w:rFonts w:asciiTheme="minorHAnsi" w:eastAsiaTheme="minorEastAsia" w:hAnsiTheme="minorHAnsi"/>
+          <w:noProof/>
+          <w:kern w:val="2"/>
+          <w:sz w:val="24"/>
+          <w:szCs w:val="24"/>
+          <w:lang w:val="es-MX" w:eastAsia="es-MX"/>
+          <w14:ligatures w14:val="standardContextual"/>
+        </w:rPr>
+      </w:pPr>
+      <w:hyperlink w:anchor="_Toc240929553" w:history="1">
+        <w:r>
+          <w:rPr>
+            <w:rStyle w:val="Hipervnculo"/>
+            <w:noProof/>
+          </w:rPr>
+          <w:t>Persistent session</w:t>
+        </w:r>
+        <w:r>
+          <w:rPr>
+            <w:noProof/>
+            <w:webHidden/>
+          </w:rPr>
+          <w:tab/>
+        </w:r>
+        <w:r>
+          <w:rPr>
+            <w:noProof/>
+            <w:webHidden/>
+          </w:rPr>
+          <w:fldChar w:fldCharType="begin"/>
+        </w:r>
+        <w:r>
+          <w:rPr>
+            <w:noProof/>
+            <w:webHidden/>
+          </w:rPr>
+          <w:instrText xml:space="preserve"> PAGEREF _Toc240929553 \h </w:instrText>
+        </w:r>
+        <w:r>
+          <w:rPr>
+            <w:noProof/>
+            <w:webHidden/>
+          </w:rPr>
+        </w:r>
+        <w:r>
+          <w:rPr>
+            <w:noProof/>
+            <w:webHidden/>
+          </w:rPr>
+          <w:fldChar w:fldCharType="separate"/>
+        </w:r>
+        <w:r>
+          <w:rPr>
+            <w:noProof/>
+            <w:webHidden/>
+          </w:rPr>
+          <w:t>13</w:t>
+        </w:r>
+        <w:r>
+          <w:rPr>
+            <w:noProof/>
+            <w:webHidden/>
+          </w:rPr>
+          <w:fldChar w:fldCharType="end"/>
+        </w:r>
+      </w:hyperlink>
+    </w:p>
+    <w:p>
+      <w:pPr>
+        <w:pStyle w:val="TDC2"/>
+        <w:tabs>
+          <w:tab w:val="right" w:leader="dot" w:pos="9350"/>
+        </w:tabs>
+        <w:rPr>
+          <w:rFonts w:asciiTheme="minorHAnsi" w:eastAsiaTheme="minorEastAsia" w:hAnsiTheme="minorHAnsi"/>
+          <w:noProof/>
+          <w:kern w:val="2"/>
+          <w:sz w:val="24"/>
+          <w:szCs w:val="24"/>
+          <w:lang w:val="es-MX" w:eastAsia="es-MX"/>
+          <w14:ligatures w14:val="standardContextual"/>
+        </w:rPr>
+      </w:pPr>
+      <w:hyperlink w:anchor="_Toc240929554" w:history="1">
+        <w:r>
+          <w:rPr>
+            <w:rStyle w:val="Hipervnculo"/>
+            <w:noProof/>
+          </w:rPr>
+          <w:t>User list with no connection</w:t>
+        </w:r>
+        <w:r>
+          <w:rPr>
+            <w:noProof/>
+            <w:webHidden/>
+          </w:rPr>
+          <w:tab/>
+        </w:r>
+        <w:r>
+          <w:rPr>
+            <w:noProof/>
+            <w:webHidden/>
+          </w:rPr>
+          <w:fldChar w:fldCharType="begin"/>
+        </w:r>
+        <w:r>
+          <w:rPr>
+            <w:noProof/>
+            <w:webHidden/>
+          </w:rPr>
+          <w:instrText xml:space="preserve"> PAGEREF _Toc240929554 \h </w:instrText>
+        </w:r>
+        <w:r>
+          <w:rPr>
+            <w:noProof/>
+            <w:webHidden/>
+          </w:rPr>
+        </w:r>
+        <w:r>
+          <w:rPr>
+            <w:noProof/>
+            <w:webHidden/>
+          </w:rPr>
+          <w:fldChar w:fldCharType="separate"/>
+        </w:r>
+        <w:r>
+          <w:rPr>
+            <w:noProof/>
+            <w:webHidden/>
+          </w:rPr>
+          <w:t>14</w:t>
         </w:r>
         <w:r>
           <w:rPr>
@@ -1700,13 +1996,13 @@
           <w14:ligatures w14:val="standardContextual"/>
         </w:rPr>
       </w:pPr>
-      <w:hyperlink w:anchor="_Toc240928935" w:history="1">
+      <w:hyperlink w:anchor="_Toc240929555" w:history="1">
         <w:r>
           <w:rPr>
             <w:rStyle w:val="Hipervnculo"/>
             <w:noProof/>
           </w:rPr>
-          <w:t>Files Delivered</w:t>
+          <w:t>Technical Verification</w:t>
         </w:r>
         <w:r>
           <w:rPr>
@@ -1727,7 +2023,7 @@
             <w:noProof/>
             <w:webHidden/>
           </w:rPr>
-          <w:instrText xml:space="preserve"> PAGEREF _Toc240928935 \h </w:instrText>
+          <w:instrText xml:space="preserve"> PAGEREF _Toc240929555 \h </w:instrText>
         </w:r>
         <w:r>
           <w:rPr>
@@ -1747,7 +2043,7 @@
             <w:noProof/>
             <w:webHidden/>
           </w:rPr>
-          <w:t>10</w:t>
+          <w:t>14</w:t>
         </w:r>
         <w:r>
           <w:rPr>
@@ -1774,13 +2070,13 @@
           <w14:ligatures w14:val="standardContextual"/>
         </w:rPr>
       </w:pPr>
-      <w:hyperlink w:anchor="_Toc240928936" w:history="1">
+      <w:hyperlink w:anchor="_Toc240929556" w:history="1">
         <w:r>
           <w:rPr>
             <w:rStyle w:val="Hipervnculo"/>
             <w:noProof/>
           </w:rPr>
-          <w:t>New files</w:t>
+          <w:t>A bug found while capturing the screenshots</w:t>
         </w:r>
         <w:r>
           <w:rPr>
@@ -1801,7 +2097,7 @@
             <w:noProof/>
             <w:webHidden/>
           </w:rPr>
-          <w:instrText xml:space="preserve"> PAGEREF _Toc240928936 \h </w:instrText>
+          <w:instrText xml:space="preserve"> PAGEREF _Toc240929556 \h </w:instrText>
         </w:r>
         <w:r>
           <w:rPr>
@@ -1821,7 +2117,81 @@
             <w:noProof/>
             <w:webHidden/>
           </w:rPr>
-          <w:t>10</w:t>
+          <w:t>15</w:t>
+        </w:r>
+        <w:r>
+          <w:rPr>
+            <w:noProof/>
+            <w:webHidden/>
+          </w:rPr>
+          <w:fldChar w:fldCharType="end"/>
+        </w:r>
+      </w:hyperlink>
+    </w:p>
+    <w:p>
+      <w:pPr>
+        <w:pStyle w:val="TDC1"/>
+        <w:tabs>
+          <w:tab w:val="right" w:leader="dot" w:pos="9350"/>
+        </w:tabs>
+        <w:rPr>
+          <w:rFonts w:asciiTheme="minorHAnsi" w:eastAsiaTheme="minorEastAsia" w:hAnsiTheme="minorHAnsi"/>
+          <w:noProof/>
+          <w:kern w:val="2"/>
+          <w:sz w:val="24"/>
+          <w:szCs w:val="24"/>
+          <w:lang w:val="es-MX" w:eastAsia="es-MX"/>
+          <w14:ligatures w14:val="standardContextual"/>
+        </w:rPr>
+      </w:pPr>
+      <w:hyperlink w:anchor="_Toc240929557" w:history="1">
+        <w:r>
+          <w:rPr>
+            <w:rStyle w:val="Hipervnculo"/>
+            <w:noProof/>
+          </w:rPr>
+          <w:t>Files Delivered</w:t>
+        </w:r>
+        <w:r>
+          <w:rPr>
+            <w:noProof/>
+            <w:webHidden/>
+          </w:rPr>
+          <w:tab/>
+        </w:r>
+        <w:r>
+          <w:rPr>
+            <w:noProof/>
+            <w:webHidden/>
+          </w:rPr>
+          <w:fldChar w:fldCharType="begin"/>
+        </w:r>
+        <w:r>
+          <w:rPr>
+            <w:noProof/>
+            <w:webHidden/>
+          </w:rPr>
+          <w:instrText xml:space="preserve"> PAGEREF _Toc240929557 \h </w:instrText>
+        </w:r>
+        <w:r>
+          <w:rPr>
+            <w:noProof/>
+            <w:webHidden/>
+          </w:rPr>
+        </w:r>
+        <w:r>
+          <w:rPr>
+            <w:noProof/>
+            <w:webHidden/>
+          </w:rPr>
+          <w:fldChar w:fldCharType="separate"/>
+        </w:r>
+        <w:r>
+          <w:rPr>
+            <w:noProof/>
+            <w:webHidden/>
+          </w:rPr>
+          <w:t>16</w:t>
         </w:r>
         <w:r>
           <w:rPr>
@@ -1848,13 +2218,13 @@
           <w14:ligatures w14:val="standardContextual"/>
         </w:rPr>
       </w:pPr>
-      <w:hyperlink w:anchor="_Toc240928937" w:history="1">
+      <w:hyperlink w:anchor="_Toc240929558" w:history="1">
         <w:r>
           <w:rPr>
             <w:rStyle w:val="Hipervnculo"/>
             <w:noProof/>
           </w:rPr>
-          <w:t>Modified files</w:t>
+          <w:t>New files</w:t>
         </w:r>
         <w:r>
           <w:rPr>
@@ -1875,7 +2245,7 @@
             <w:noProof/>
             <w:webHidden/>
           </w:rPr>
-          <w:instrText xml:space="preserve"> PAGEREF _Toc240928937 \h </w:instrText>
+          <w:instrText xml:space="preserve"> PAGEREF _Toc240929558 \h </w:instrText>
         </w:r>
         <w:r>
           <w:rPr>
@@ -1895,7 +2265,7 @@
             <w:noProof/>
             <w:webHidden/>
           </w:rPr>
-          <w:t>10</w:t>
+          <w:t>16</w:t>
         </w:r>
         <w:r>
           <w:rPr>
@@ -1922,13 +2292,13 @@
           <w14:ligatures w14:val="standardContextual"/>
         </w:rPr>
       </w:pPr>
-      <w:hyperlink w:anchor="_Toc240928938" w:history="1">
+      <w:hyperlink w:anchor="_Toc240929559" w:history="1">
         <w:r>
           <w:rPr>
             <w:rStyle w:val="Hipervnculo"/>
             <w:noProof/>
           </w:rPr>
-          <w:t>Resulting structure</w:t>
+          <w:t>Modified files</w:t>
         </w:r>
         <w:r>
           <w:rPr>
@@ -1949,7 +2319,7 @@
             <w:noProof/>
             <w:webHidden/>
           </w:rPr>
-          <w:instrText xml:space="preserve"> PAGEREF _Toc240928938 \h </w:instrText>
+          <w:instrText xml:space="preserve"> PAGEREF _Toc240929559 \h </w:instrText>
         </w:r>
         <w:r>
           <w:rPr>
@@ -1969,7 +2339,7 @@
             <w:noProof/>
             <w:webHidden/>
           </w:rPr>
-          <w:t>10</w:t>
+          <w:t>16</w:t>
         </w:r>
         <w:r>
           <w:rPr>
@@ -1996,13 +2366,13 @@
           <w14:ligatures w14:val="standardContextual"/>
         </w:rPr>
       </w:pPr>
-      <w:hyperlink w:anchor="_Toc240928939" w:history="1">
+      <w:hyperlink w:anchor="_Toc240929560" w:history="1">
         <w:r>
           <w:rPr>
             <w:rStyle w:val="Hipervnculo"/>
             <w:noProof/>
           </w:rPr>
-          <w:t>Version control</w:t>
+          <w:t>Resulting structure</w:t>
         </w:r>
         <w:r>
           <w:rPr>
@@ -2023,7 +2393,7 @@
             <w:noProof/>
             <w:webHidden/>
           </w:rPr>
-          <w:instrText xml:space="preserve"> PAGEREF _Toc240928939 \h </w:instrText>
+          <w:instrText xml:space="preserve"> PAGEREF _Toc240929560 \h </w:instrText>
         </w:r>
         <w:r>
           <w:rPr>
@@ -2043,7 +2413,7 @@
             <w:noProof/>
             <w:webHidden/>
           </w:rPr>
-          <w:t>11</w:t>
+          <w:t>16</w:t>
         </w:r>
         <w:r>
           <w:rPr>
@@ -2070,12 +2440,86 @@
           <w14:ligatures w14:val="standardContextual"/>
         </w:rPr>
       </w:pPr>
-      <w:hyperlink w:anchor="_Toc240928940" w:history="1">
+      <w:hyperlink w:anchor="_Toc240929561" w:history="1">
         <w:r>
           <w:rPr>
             <w:rStyle w:val="Hipervnculo"/>
             <w:noProof/>
           </w:rPr>
+          <w:t>Version control</w:t>
+        </w:r>
+        <w:r>
+          <w:rPr>
+            <w:noProof/>
+            <w:webHidden/>
+          </w:rPr>
+          <w:tab/>
+        </w:r>
+        <w:r>
+          <w:rPr>
+            <w:noProof/>
+            <w:webHidden/>
+          </w:rPr>
+          <w:fldChar w:fldCharType="begin"/>
+        </w:r>
+        <w:r>
+          <w:rPr>
+            <w:noProof/>
+            <w:webHidden/>
+          </w:rPr>
+          <w:instrText xml:space="preserve"> PAGEREF _Toc240929561 \h </w:instrText>
+        </w:r>
+        <w:r>
+          <w:rPr>
+            <w:noProof/>
+            <w:webHidden/>
+          </w:rPr>
+        </w:r>
+        <w:r>
+          <w:rPr>
+            <w:noProof/>
+            <w:webHidden/>
+          </w:rPr>
+          <w:fldChar w:fldCharType="separate"/>
+        </w:r>
+        <w:r>
+          <w:rPr>
+            <w:noProof/>
+            <w:webHidden/>
+          </w:rPr>
+          <w:t>17</w:t>
+        </w:r>
+        <w:r>
+          <w:rPr>
+            <w:noProof/>
+            <w:webHidden/>
+          </w:rPr>
+          <w:fldChar w:fldCharType="end"/>
+        </w:r>
+      </w:hyperlink>
+    </w:p>
+    <w:p>
+      <w:pPr>
+        <w:pStyle w:val="TDC2"/>
+        <w:tabs>
+          <w:tab w:val="right" w:leader="dot" w:pos="9350"/>
+        </w:tabs>
+        <w:rPr>
+          <w:rFonts w:asciiTheme="minorHAnsi" w:eastAsiaTheme="minorEastAsia" w:hAnsiTheme="minorHAnsi"/>
+          <w:noProof/>
+          <w:kern w:val="2"/>
+          <w:sz w:val="24"/>
+          <w:szCs w:val="24"/>
+          <w:lang w:val="es-MX" w:eastAsia="es-MX"/>
+          <w14:ligatures w14:val="standardContextual"/>
+        </w:rPr>
+      </w:pPr>
+      <w:hyperlink w:anchor="_Toc240929562" w:history="1">
+        <w:r>
+          <w:rPr>
+            <w:rStyle w:val="Hipervnculo"/>
+            <w:noProof/>
+          </w:rPr>
           <w:t>How to run it</w:t>
         </w:r>
         <w:r>
@@ -2097,7 +2541,7 @@
             <w:noProof/>
             <w:webHidden/>
           </w:rPr>
-          <w:instrText xml:space="preserve"> PAGEREF _Toc240928940 \h </w:instrText>
+          <w:instrText xml:space="preserve"> PAGEREF _Toc240929562 \h </w:instrText>
         </w:r>
         <w:r>
           <w:rPr>
@@ -2117,7 +2561,7 @@
             <w:noProof/>
             <w:webHidden/>
           </w:rPr>
-          <w:t>11</w:t>
+          <w:t>17</w:t>
         </w:r>
         <w:r>
           <w:rPr>
@@ -2144,7 +2588,7 @@
           <w14:ligatures w14:val="standardContextual"/>
         </w:rPr>
       </w:pPr>
-      <w:hyperlink w:anchor="_Toc240928941" w:history="1">
+      <w:hyperlink w:anchor="_Toc240929563" w:history="1">
         <w:r>
           <w:rPr>
             <w:rStyle w:val="Hipervnculo"/>
@@ -2171,7 +2615,7 @@
             <w:noProof/>
             <w:webHidden/>
           </w:rPr>
-          <w:instrText xml:space="preserve"> PAGEREF _Toc240928941 \h </w:instrText>
+          <w:instrText xml:space="preserve"> PAGEREF _Toc240929563 \h </w:instrText>
         </w:r>
         <w:r>
           <w:rPr>
@@ -2191,7 +2635,7 @@
             <w:noProof/>
             <w:webHidden/>
           </w:rPr>
-          <w:t>11</w:t>
+          <w:t>17</w:t>
         </w:r>
         <w:r>
           <w:rPr>
@@ -2218,7 +2662,7 @@
           <w14:ligatures w14:val="standardContextual"/>
         </w:rPr>
       </w:pPr>
-      <w:hyperlink w:anchor="_Toc240928942" w:history="1">
+      <w:hyperlink w:anchor="_Toc240929564" w:history="1">
         <w:r>
           <w:rPr>
             <w:rStyle w:val="Hipervnculo"/>
@@ -2245,7 +2689,7 @@
             <w:noProof/>
             <w:webHidden/>
           </w:rPr>
-          <w:instrText xml:space="preserve"> PAGEREF _Toc240928942 \h </w:instrText>
+          <w:instrText xml:space="preserve"> PAGEREF _Toc240929564 \h </w:instrText>
         </w:r>
         <w:r>
           <w:rPr>
@@ -2265,7 +2709,7 @@
             <w:noProof/>
             <w:webHidden/>
           </w:rPr>
-          <w:t>11</w:t>
+          <w:t>17</w:t>
         </w:r>
         <w:r>
           <w:rPr>
@@ -2290,7 +2734,7 @@
       <w:pPr>
         <w:pStyle w:val="Ttulo1"/>
       </w:pPr>
-      <w:bookmarkStart w:id="0" w:name="_Toc240928917"/>
+      <w:bookmarkStart w:id="0" w:name="_Toc240929533"/>
       <w:r>
         <w:lastRenderedPageBreak/>
         <w:t>Delivery Objective</w:t>
@@ -2573,7 +3017,7 @@
       <w:pPr>
         <w:pStyle w:val="Ttulo1"/>
       </w:pPr>
-      <w:bookmarkStart w:id="1" w:name="_Toc240928918"/>
+      <w:bookmarkStart w:id="1" w:name="_Toc240929534"/>
       <w:r>
         <w:t>Chosen Technology: Capacitor Preferences</w:t>
       </w:r>
@@ -2605,7 +3049,7 @@
       <w:pPr>
         <w:pStyle w:val="Ttulo2"/>
       </w:pPr>
-      <w:bookmarkStart w:id="2" w:name="_Toc240928919"/>
+      <w:bookmarkStart w:id="2" w:name="_Toc240929535"/>
       <w:r>
         <w:t>Why</w:t>
       </w:r>
@@ -2827,7 +3271,7 @@
       <w:pPr>
         <w:pStyle w:val="Ttulo2"/>
       </w:pPr>
-      <w:bookmarkStart w:id="3" w:name="_Toc240928920"/>
+      <w:bookmarkStart w:id="3" w:name="_Toc240929536"/>
       <w:r>
         <w:t>A deliberate limitation</w:t>
       </w:r>
@@ -2871,7 +3315,7 @@
       <w:pPr>
         <w:pStyle w:val="Ttulo1"/>
       </w:pPr>
-      <w:bookmarkStart w:id="4" w:name="_Toc240928921"/>
+      <w:bookmarkStart w:id="4" w:name="_Toc240929537"/>
       <w:r>
         <w:t>What Was Implemented</w:t>
       </w:r>
@@ -3249,7 +3693,7 @@
           <w:noProof/>
         </w:rPr>
         <w:drawing>
-          <wp:inline distT="0" distB="0" distL="0" distR="0" wp14:anchorId="5EC64061" wp14:editId="76A0B8E1">
+          <wp:inline distT="0" distB="0" distL="0" distR="0" wp14:anchorId="504F7607" wp14:editId="136FD7B7">
             <wp:extent cx="5486400" cy="4270237"/>
             <wp:effectExtent l="0" t="0" r="0" b="0"/>
             <wp:docPr id="3" name="Picture 3"/>
@@ -3303,7 +3747,7 @@
       <w:pPr>
         <w:pStyle w:val="Ttulo1"/>
       </w:pPr>
-      <w:bookmarkStart w:id="5" w:name="_Toc240928922"/>
+      <w:bookmarkStart w:id="5" w:name="_Toc240929538"/>
       <w:r>
         <w:t>Architecture</w:t>
       </w:r>
@@ -3313,7 +3757,7 @@
       <w:pPr>
         <w:pStyle w:val="Ttulo2"/>
       </w:pPr>
-      <w:bookmarkStart w:id="6" w:name="_Toc240928923"/>
+      <w:bookmarkStart w:id="6" w:name="_Toc240929539"/>
       <w:r>
         <w:t>Class diagram of the persistence layer</w:t>
       </w:r>
@@ -3328,7 +3772,7 @@
           <w:noProof/>
         </w:rPr>
         <w:drawing>
-          <wp:inline distT="0" distB="0" distL="0" distR="0" wp14:anchorId="0EE1824F" wp14:editId="7C50B9D5">
+          <wp:inline distT="0" distB="0" distL="0" distR="0" wp14:anchorId="44B353E8" wp14:editId="2EA6CF9D">
             <wp:extent cx="5760720" cy="3493598"/>
             <wp:effectExtent l="0" t="0" r="0" b="0"/>
             <wp:docPr id="4" name="Picture 4"/>
@@ -3382,7 +3826,7 @@
       <w:pPr>
         <w:pStyle w:val="Ttulo2"/>
       </w:pPr>
-      <w:bookmarkStart w:id="7" w:name="_Toc240928924"/>
+      <w:bookmarkStart w:id="7" w:name="_Toc240929540"/>
       <w:r>
         <w:t>StorageService — the base layer</w:t>
       </w:r>
@@ -3711,7 +4155,7 @@
       <w:pPr>
         <w:pStyle w:val="Ttulo2"/>
       </w:pPr>
-      <w:bookmarkStart w:id="8" w:name="_Toc240928925"/>
+      <w:bookmarkStart w:id="8" w:name="_Toc240929541"/>
       <w:r>
         <w:t>Persistent session</w:t>
       </w:r>
@@ -3927,7 +4371,7 @@
       <w:pPr>
         <w:pStyle w:val="Ttulo2"/>
       </w:pPr>
-      <w:bookmarkStart w:id="9" w:name="_Toc240928926"/>
+      <w:bookmarkStart w:id="9" w:name="_Toc240929542"/>
       <w:r>
         <w:t>Offline cache of the user CRUD</w:t>
       </w:r>
@@ -4166,7 +4610,7 @@
       <w:pPr>
         <w:pStyle w:val="Ttulo2"/>
       </w:pPr>
-      <w:bookmarkStart w:id="10" w:name="_Toc240928927"/>
+      <w:bookmarkStart w:id="10" w:name="_Toc240929543"/>
       <w:r>
         <w:t>Nota entity: full CRUD without a server</w:t>
       </w:r>
@@ -4704,7 +5148,7 @@
       <w:pPr>
         <w:pStyle w:val="Ttulo1"/>
       </w:pPr>
-      <w:bookmarkStart w:id="11" w:name="_Toc240928928"/>
+      <w:bookmarkStart w:id="11" w:name="_Toc240929544"/>
       <w:r>
         <w:t>Persistent CRUD Operations</w:t>
       </w:r>
@@ -5165,7 +5609,7 @@
           <w:noProof/>
         </w:rPr>
         <w:drawing>
-          <wp:inline distT="0" distB="0" distL="0" distR="0" wp14:anchorId="3FF615DE" wp14:editId="5EB1B84B">
+          <wp:inline distT="0" distB="0" distL="0" distR="0" wp14:anchorId="507775D4" wp14:editId="11F01DE9">
             <wp:extent cx="4754880" cy="4625107"/>
             <wp:effectExtent l="0" t="0" r="0" b="0"/>
             <wp:docPr id="5" name="Picture 5"/>
@@ -5219,7 +5663,7 @@
       <w:pPr>
         <w:pStyle w:val="Ttulo1"/>
       </w:pPr>
-      <w:bookmarkStart w:id="12" w:name="_Toc240928929"/>
+      <w:bookmarkStart w:id="12" w:name="_Toc240929545"/>
       <w:r>
         <w:t>How to Verify That the Information Persists</w:t>
       </w:r>
@@ -5237,7 +5681,7 @@
       <w:pPr>
         <w:pStyle w:val="Ttulo2"/>
       </w:pPr>
-      <w:bookmarkStart w:id="13" w:name="_Toc240928930"/>
+      <w:bookmarkStart w:id="13" w:name="_Toc240929546"/>
       <w:r>
         <w:t>Test 1 — Notes (XAMPP not required)</w:t>
       </w:r>
@@ -5302,7 +5746,7 @@
       <w:pPr>
         <w:pStyle w:val="Ttulo2"/>
       </w:pPr>
-      <w:bookmarkStart w:id="14" w:name="_Toc240928931"/>
+      <w:bookmarkStart w:id="14" w:name="_Toc240929547"/>
       <w:r>
         <w:t>Test 2 — Session</w:t>
       </w:r>
@@ -5356,7 +5800,7 @@
       <w:pPr>
         <w:pStyle w:val="Ttulo2"/>
       </w:pPr>
-      <w:bookmarkStart w:id="15" w:name="_Toc240928932"/>
+      <w:bookmarkStart w:id="15" w:name="_Toc240929548"/>
       <w:r>
         <w:t>Test 3 — Offline cache of users</w:t>
       </w:r>
@@ -5410,7 +5854,7 @@
       <w:pPr>
         <w:pStyle w:val="Ttulo2"/>
       </w:pPr>
-      <w:bookmarkStart w:id="16" w:name="_Toc240928933"/>
+      <w:bookmarkStart w:id="16" w:name="_Toc240929549"/>
       <w:r>
         <w:t>How to inspect it from the inside</w:t>
       </w:r>
@@ -5480,11 +5924,642 @@
       <w:pPr>
         <w:pStyle w:val="Ttulo1"/>
       </w:pPr>
-      <w:bookmarkStart w:id="17" w:name="_Toc240928934"/>
+      <w:bookmarkStart w:id="17" w:name="_Toc240929550"/>
+      <w:r>
+        <w:t>Screenshots of the Running Application</w:t>
+      </w:r>
+      <w:bookmarkEnd w:id="17"/>
+    </w:p>
+    <w:p>
+      <w:r>
+        <w:rPr>
+          <w:sz w:val="21"/>
+        </w:rPr>
+        <w:t>The screens below were captured from the application actually running, following the three tests described above.</w:t>
+      </w:r>
+    </w:p>
+    <w:p>
+      <w:pPr>
+        <w:pStyle w:val="Ttulo2"/>
+      </w:pPr>
+      <w:bookmarkStart w:id="18" w:name="_Toc240929551"/>
+      <w:r>
+        <w:t>Local notes: the full CRUD</w:t>
+      </w:r>
+      <w:bookmarkEnd w:id="18"/>
+    </w:p>
+    <w:p>
+      <w:pPr>
+        <w:jc w:val="center"/>
+      </w:pPr>
+      <w:r>
+        <w:rPr>
+          <w:noProof/>
+        </w:rPr>
+        <w:drawing>
+          <wp:inline distT="0" distB="0" distL="0" distR="0" wp14:anchorId="43B82998" wp14:editId="0B207DAB">
+            <wp:extent cx="5120640" cy="2420302"/>
+            <wp:effectExtent l="0" t="0" r="0" b="0"/>
+            <wp:docPr id="6" name="Picture 6"/>
+            <wp:cNvGraphicFramePr>
+              <a:graphicFrameLocks xmlns:a="http://schemas.openxmlformats.org/drawingml/2006/main" noChangeAspect="1"/>
+            </wp:cNvGraphicFramePr>
+            <a:graphic xmlns:a="http://schemas.openxmlformats.org/drawingml/2006/main">
+              <a:graphicData uri="http://schemas.openxmlformats.org/drawingml/2006/picture">
+                <pic:pic xmlns:pic="http://schemas.openxmlformats.org/drawingml/2006/picture">
+                  <pic:nvPicPr>
+                    <pic:cNvPr id="0" name="14-notas-vacio.png"/>
+                    <pic:cNvPicPr/>
+                  </pic:nvPicPr>
+                  <pic:blipFill>
+                    <a:blip r:embed="rId11"/>
+                    <a:stretch>
+                      <a:fillRect/>
+                    </a:stretch>
+                  </pic:blipFill>
+                  <pic:spPr>
+                    <a:xfrm>
+                      <a:off x="0" y="0"/>
+                      <a:ext cx="5120640" cy="2420302"/>
+                    </a:xfrm>
+                    <a:prstGeom prst="rect">
+                      <a:avLst/>
+                    </a:prstGeom>
+                  </pic:spPr>
+                </pic:pic>
+              </a:graphicData>
+            </a:graphic>
+          </wp:inline>
+        </w:drawing>
+      </w:r>
+    </w:p>
+    <w:p>
+      <w:pPr>
+        <w:jc w:val="center"/>
+      </w:pPr>
+      <w:r>
+        <w:rPr>
+          <w:i/>
+          <w:color w:val="555555"/>
+          <w:sz w:val="18"/>
+        </w:rPr>
+        <w:t>Figure 4. Empty state: the Notas tab before any note is created.</w:t>
+      </w:r>
+    </w:p>
+    <w:p/>
+    <w:p>
+      <w:pPr>
+        <w:jc w:val="center"/>
+      </w:pPr>
+      <w:r>
+        <w:rPr>
+          <w:noProof/>
+        </w:rPr>
+        <w:drawing>
+          <wp:inline distT="0" distB="0" distL="0" distR="0" wp14:anchorId="7881CD9A" wp14:editId="26B98DE6">
+            <wp:extent cx="5120640" cy="3040380"/>
+            <wp:effectExtent l="0" t="0" r="0" b="0"/>
+            <wp:docPr id="7" name="Picture 7"/>
+            <wp:cNvGraphicFramePr>
+              <a:graphicFrameLocks xmlns:a="http://schemas.openxmlformats.org/drawingml/2006/main" noChangeAspect="1"/>
+            </wp:cNvGraphicFramePr>
+            <a:graphic xmlns:a="http://schemas.openxmlformats.org/drawingml/2006/main">
+              <a:graphicData uri="http://schemas.openxmlformats.org/drawingml/2006/picture">
+                <pic:pic xmlns:pic="http://schemas.openxmlformats.org/drawingml/2006/picture">
+                  <pic:nvPicPr>
+                    <pic:cNvPr id="0" name="15-notas-alta.png"/>
+                    <pic:cNvPicPr/>
+                  </pic:nvPicPr>
+                  <pic:blipFill>
+                    <a:blip r:embed="rId12"/>
+                    <a:stretch>
+                      <a:fillRect/>
+                    </a:stretch>
+                  </pic:blipFill>
+                  <pic:spPr>
+                    <a:xfrm>
+                      <a:off x="0" y="0"/>
+                      <a:ext cx="5120640" cy="3040380"/>
+                    </a:xfrm>
+                    <a:prstGeom prst="rect">
+                      <a:avLst/>
+                    </a:prstGeom>
+                  </pic:spPr>
+                </pic:pic>
+              </a:graphicData>
+            </a:graphic>
+          </wp:inline>
+        </w:drawing>
+      </w:r>
+    </w:p>
+    <w:p>
+      <w:pPr>
+        <w:jc w:val="center"/>
+      </w:pPr>
+      <w:r>
+        <w:rPr>
+          <w:i/>
+          <w:color w:val="555555"/>
+          <w:sz w:val="18"/>
+        </w:rPr>
+        <w:t>Figure 5. Create: three notes added, each stored on the device as it is created.</w:t>
+      </w:r>
+    </w:p>
+    <w:p/>
+    <w:p>
+      <w:pPr>
+        <w:jc w:val="center"/>
+      </w:pPr>
+      <w:r>
+        <w:rPr>
+          <w:noProof/>
+        </w:rPr>
+        <w:drawing>
+          <wp:inline distT="0" distB="0" distL="0" distR="0" wp14:anchorId="37857B42" wp14:editId="16D6707D">
+            <wp:extent cx="5120640" cy="3040380"/>
+            <wp:effectExtent l="0" t="0" r="0" b="0"/>
+            <wp:docPr id="8" name="Picture 8"/>
+            <wp:cNvGraphicFramePr>
+              <a:graphicFrameLocks xmlns:a="http://schemas.openxmlformats.org/drawingml/2006/main" noChangeAspect="1"/>
+            </wp:cNvGraphicFramePr>
+            <a:graphic xmlns:a="http://schemas.openxmlformats.org/drawingml/2006/main">
+              <a:graphicData uri="http://schemas.openxmlformats.org/drawingml/2006/picture">
+                <pic:pic xmlns:pic="http://schemas.openxmlformats.org/drawingml/2006/picture">
+                  <pic:nvPicPr>
+                    <pic:cNvPr id="0" name="16-notas-favorita.png"/>
+                    <pic:cNvPicPr/>
+                  </pic:nvPicPr>
+                  <pic:blipFill>
+                    <a:blip r:embed="rId13"/>
+                    <a:stretch>
+                      <a:fillRect/>
+                    </a:stretch>
+                  </pic:blipFill>
+                  <pic:spPr>
+                    <a:xfrm>
+                      <a:off x="0" y="0"/>
+                      <a:ext cx="5120640" cy="3040380"/>
+                    </a:xfrm>
+                    <a:prstGeom prst="rect">
+                      <a:avLst/>
+                    </a:prstGeom>
+                  </pic:spPr>
+                </pic:pic>
+              </a:graphicData>
+            </a:graphic>
+          </wp:inline>
+        </w:drawing>
+      </w:r>
+    </w:p>
+    <w:p>
+      <w:pPr>
+        <w:jc w:val="center"/>
+      </w:pPr>
+      <w:r>
+        <w:rPr>
+          <w:i/>
+          <w:color w:val="555555"/>
+          <w:sz w:val="18"/>
+        </w:rPr>
+        <w:t>Figure 6. Partial update: only the favourite field changes, marked with a star.</w:t>
+      </w:r>
+    </w:p>
+    <w:p/>
+    <w:p>
+      <w:pPr>
+        <w:jc w:val="center"/>
+      </w:pPr>
+      <w:r>
+        <w:rPr>
+          <w:noProof/>
+        </w:rPr>
+        <w:drawing>
+          <wp:inline distT="0" distB="0" distL="0" distR="0" wp14:anchorId="3BA63943" wp14:editId="72EF8E9C">
+            <wp:extent cx="5120640" cy="3040380"/>
+            <wp:effectExtent l="0" t="0" r="0" b="0"/>
+            <wp:docPr id="9" name="Picture 9"/>
+            <wp:cNvGraphicFramePr>
+              <a:graphicFrameLocks xmlns:a="http://schemas.openxmlformats.org/drawingml/2006/main" noChangeAspect="1"/>
+            </wp:cNvGraphicFramePr>
+            <a:graphic xmlns:a="http://schemas.openxmlformats.org/drawingml/2006/main">
+              <a:graphicData uri="http://schemas.openxmlformats.org/drawingml/2006/picture">
+                <pic:pic xmlns:pic="http://schemas.openxmlformats.org/drawingml/2006/picture">
+                  <pic:nvPicPr>
+                    <pic:cNvPr id="0" name="17-notas-editar.png"/>
+                    <pic:cNvPicPr/>
+                  </pic:nvPicPr>
+                  <pic:blipFill>
+                    <a:blip r:embed="rId14"/>
+                    <a:stretch>
+                      <a:fillRect/>
+                    </a:stretch>
+                  </pic:blipFill>
+                  <pic:spPr>
+                    <a:xfrm>
+                      <a:off x="0" y="0"/>
+                      <a:ext cx="5120640" cy="3040380"/>
+                    </a:xfrm>
+                    <a:prstGeom prst="rect">
+                      <a:avLst/>
+                    </a:prstGeom>
+                  </pic:spPr>
+                </pic:pic>
+              </a:graphicData>
+            </a:graphic>
+          </wp:inline>
+        </w:drawing>
+      </w:r>
+    </w:p>
+    <w:p>
+      <w:pPr>
+        <w:jc w:val="center"/>
+      </w:pPr>
+      <w:r>
+        <w:rPr>
+          <w:i/>
+          <w:color w:val="555555"/>
+          <w:sz w:val="18"/>
+        </w:rPr>
+        <w:t>Figure 7. Update: the note is loaded into the form for editing.</w:t>
+      </w:r>
+    </w:p>
+    <w:p/>
+    <w:p>
+      <w:pPr>
+        <w:pStyle w:val="Ttulo2"/>
+      </w:pPr>
+      <w:bookmarkStart w:id="19" w:name="_Toc240929552"/>
+      <w:r>
+        <w:t>The proof: the data survives a restart</w:t>
+      </w:r>
+      <w:bookmarkEnd w:id="19"/>
+    </w:p>
+    <w:p>
+      <w:r>
+        <w:rPr>
+          <w:sz w:val="21"/>
+        </w:rPr>
+        <w:t xml:space="preserve">The application was closed and reopened. </w:t>
+      </w:r>
+      <w:r>
+        <w:rPr>
+          <w:b/>
+          <w:sz w:val="21"/>
+        </w:rPr>
+        <w:t>Nothing was typed in again</w:t>
+      </w:r>
+      <w:r>
+        <w:rPr>
+          <w:sz w:val="21"/>
+        </w:rPr>
+        <w:t>: the three notes come back from the device, keeping the star on the favourite one, the creation dates and the 'Editada' timestamp on the note that was modified.</w:t>
+      </w:r>
+    </w:p>
+    <w:p>
+      <w:pPr>
+        <w:jc w:val="center"/>
+      </w:pPr>
+      <w:r>
+        <w:rPr>
+          <w:noProof/>
+        </w:rPr>
+        <w:drawing>
+          <wp:inline distT="0" distB="0" distL="0" distR="0" wp14:anchorId="6B3EFD9E" wp14:editId="6A94757B">
+            <wp:extent cx="5120640" cy="3040380"/>
+            <wp:effectExtent l="0" t="0" r="0" b="0"/>
+            <wp:docPr id="10" name="Picture 10"/>
+            <wp:cNvGraphicFramePr>
+              <a:graphicFrameLocks xmlns:a="http://schemas.openxmlformats.org/drawingml/2006/main" noChangeAspect="1"/>
+            </wp:cNvGraphicFramePr>
+            <a:graphic xmlns:a="http://schemas.openxmlformats.org/drawingml/2006/main">
+              <a:graphicData uri="http://schemas.openxmlformats.org/drawingml/2006/picture">
+                <pic:pic xmlns:pic="http://schemas.openxmlformats.org/drawingml/2006/picture">
+                  <pic:nvPicPr>
+                    <pic:cNvPr id="0" name="18-notas-tras-reabrir.png"/>
+                    <pic:cNvPicPr/>
+                  </pic:nvPicPr>
+                  <pic:blipFill>
+                    <a:blip r:embed="rId15"/>
+                    <a:stretch>
+                      <a:fillRect/>
+                    </a:stretch>
+                  </pic:blipFill>
+                  <pic:spPr>
+                    <a:xfrm>
+                      <a:off x="0" y="0"/>
+                      <a:ext cx="5120640" cy="3040380"/>
+                    </a:xfrm>
+                    <a:prstGeom prst="rect">
+                      <a:avLst/>
+                    </a:prstGeom>
+                  </pic:spPr>
+                </pic:pic>
+              </a:graphicData>
+            </a:graphic>
+          </wp:inline>
+        </w:drawing>
+      </w:r>
+    </w:p>
+    <w:p>
+      <w:pPr>
+        <w:jc w:val="center"/>
+      </w:pPr>
+      <w:r>
+        <w:rPr>
+          <w:i/>
+          <w:color w:val="555555"/>
+          <w:sz w:val="18"/>
+        </w:rPr>
+        <w:t>Figure 8. After closing and reopening the application, the information is still there.</w:t>
+      </w:r>
+    </w:p>
+    <w:p/>
+    <w:p>
+      <w:pPr>
+        <w:jc w:val="center"/>
+      </w:pPr>
+      <w:r>
+        <w:rPr>
+          <w:noProof/>
+        </w:rPr>
+        <w:drawing>
+          <wp:inline distT="0" distB="0" distL="0" distR="0" wp14:anchorId="5C6BDCDA" wp14:editId="310489FD">
+            <wp:extent cx="5120640" cy="2720340"/>
+            <wp:effectExtent l="0" t="0" r="0" b="0"/>
+            <wp:docPr id="11" name="Picture 11"/>
+            <wp:cNvGraphicFramePr>
+              <a:graphicFrameLocks xmlns:a="http://schemas.openxmlformats.org/drawingml/2006/main" noChangeAspect="1"/>
+            </wp:cNvGraphicFramePr>
+            <a:graphic xmlns:a="http://schemas.openxmlformats.org/drawingml/2006/main">
+              <a:graphicData uri="http://schemas.openxmlformats.org/drawingml/2006/picture">
+                <pic:pic xmlns:pic="http://schemas.openxmlformats.org/drawingml/2006/picture">
+                  <pic:nvPicPr>
+                    <pic:cNvPr id="0" name="19-notas-eliminar.png"/>
+                    <pic:cNvPicPr/>
+                  </pic:nvPicPr>
+                  <pic:blipFill>
+                    <a:blip r:embed="rId16"/>
+                    <a:stretch>
+                      <a:fillRect/>
+                    </a:stretch>
+                  </pic:blipFill>
+                  <pic:spPr>
+                    <a:xfrm>
+                      <a:off x="0" y="0"/>
+                      <a:ext cx="5120640" cy="2720340"/>
+                    </a:xfrm>
+                    <a:prstGeom prst="rect">
+                      <a:avLst/>
+                    </a:prstGeom>
+                  </pic:spPr>
+                </pic:pic>
+              </a:graphicData>
+            </a:graphic>
+          </wp:inline>
+        </w:drawing>
+      </w:r>
+    </w:p>
+    <w:p>
+      <w:pPr>
+        <w:jc w:val="center"/>
+      </w:pPr>
+      <w:r>
+        <w:rPr>
+          <w:i/>
+          <w:color w:val="555555"/>
+          <w:sz w:val="18"/>
+        </w:rPr>
+        <w:t>Figure 9. Delete: the note is removed from the device, and it does not come back after a restart either.</w:t>
+      </w:r>
+    </w:p>
+    <w:p/>
+    <w:p>
+      <w:pPr>
+        <w:pStyle w:val="Ttulo2"/>
+      </w:pPr>
+      <w:bookmarkStart w:id="20" w:name="_Toc240929553"/>
+      <w:r>
+        <w:t>Persistent session</w:t>
+      </w:r>
+      <w:bookmarkEnd w:id="20"/>
+    </w:p>
+    <w:p>
+      <w:pPr>
+        <w:jc w:val="center"/>
+      </w:pPr>
+      <w:r>
+        <w:rPr>
+          <w:noProof/>
+        </w:rPr>
+        <w:drawing>
+          <wp:inline distT="0" distB="0" distL="0" distR="0" wp14:anchorId="162E6CE1" wp14:editId="0E13AF89">
+            <wp:extent cx="4572000" cy="2500312"/>
+            <wp:effectExtent l="0" t="0" r="0" b="0"/>
+            <wp:docPr id="12" name="Picture 12"/>
+            <wp:cNvGraphicFramePr>
+              <a:graphicFrameLocks xmlns:a="http://schemas.openxmlformats.org/drawingml/2006/main" noChangeAspect="1"/>
+            </wp:cNvGraphicFramePr>
+            <a:graphic xmlns:a="http://schemas.openxmlformats.org/drawingml/2006/main">
+              <a:graphicData uri="http://schemas.openxmlformats.org/drawingml/2006/picture">
+                <pic:pic xmlns:pic="http://schemas.openxmlformats.org/drawingml/2006/picture">
+                  <pic:nvPicPr>
+                    <pic:cNvPr id="0" name="21-sesion-login.png"/>
+                    <pic:cNvPicPr/>
+                  </pic:nvPicPr>
+                  <pic:blipFill>
+                    <a:blip r:embed="rId17"/>
+                    <a:stretch>
+                      <a:fillRect/>
+                    </a:stretch>
+                  </pic:blipFill>
+                  <pic:spPr>
+                    <a:xfrm>
+                      <a:off x="0" y="0"/>
+                      <a:ext cx="4572000" cy="2500312"/>
+                    </a:xfrm>
+                    <a:prstGeom prst="rect">
+                      <a:avLst/>
+                    </a:prstGeom>
+                  </pic:spPr>
+                </pic:pic>
+              </a:graphicData>
+            </a:graphic>
+          </wp:inline>
+        </w:drawing>
+      </w:r>
+    </w:p>
+    <w:p>
+      <w:pPr>
+        <w:jc w:val="center"/>
+      </w:pPr>
+      <w:r>
+        <w:rPr>
+          <w:i/>
+          <w:color w:val="555555"/>
+          <w:sz w:val="18"/>
+        </w:rPr>
+        <w:t>Figure 10. With no stored session, the application asks for the credentials.</w:t>
+      </w:r>
+    </w:p>
+    <w:p/>
+    <w:p>
+      <w:pPr>
+        <w:jc w:val="center"/>
+      </w:pPr>
+      <w:r>
+        <w:rPr>
+          <w:noProof/>
+        </w:rPr>
+        <w:drawing>
+          <wp:inline distT="0" distB="0" distL="0" distR="0" wp14:anchorId="2441CC4D" wp14:editId="0B475BED">
+            <wp:extent cx="4572000" cy="2500312"/>
+            <wp:effectExtent l="0" t="0" r="0" b="0"/>
+            <wp:docPr id="13" name="Picture 13"/>
+            <wp:cNvGraphicFramePr>
+              <a:graphicFrameLocks xmlns:a="http://schemas.openxmlformats.org/drawingml/2006/main" noChangeAspect="1"/>
+            </wp:cNvGraphicFramePr>
+            <a:graphic xmlns:a="http://schemas.openxmlformats.org/drawingml/2006/main">
+              <a:graphicData uri="http://schemas.openxmlformats.org/drawingml/2006/picture">
+                <pic:pic xmlns:pic="http://schemas.openxmlformats.org/drawingml/2006/picture">
+                  <pic:nvPicPr>
+                    <pic:cNvPr id="0" name="22-sesion-restaurada.png"/>
+                    <pic:cNvPicPr/>
+                  </pic:nvPicPr>
+                  <pic:blipFill>
+                    <a:blip r:embed="rId18"/>
+                    <a:stretch>
+                      <a:fillRect/>
+                    </a:stretch>
+                  </pic:blipFill>
+                  <pic:spPr>
+                    <a:xfrm>
+                      <a:off x="0" y="0"/>
+                      <a:ext cx="4572000" cy="2500312"/>
+                    </a:xfrm>
+                    <a:prstGeom prst="rect">
+                      <a:avLst/>
+                    </a:prstGeom>
+                  </pic:spPr>
+                </pic:pic>
+              </a:graphicData>
+            </a:graphic>
+          </wp:inline>
+        </w:drawing>
+      </w:r>
+    </w:p>
+    <w:p>
+      <w:pPr>
+        <w:jc w:val="center"/>
+      </w:pPr>
+      <w:r>
+        <w:rPr>
+          <w:i/>
+          <w:color w:val="555555"/>
+          <w:sz w:val="18"/>
+        </w:rPr>
+        <w:t>Figure 11. After signing in, closing and reopening: the session is restored without asking for the credentials again.</w:t>
+      </w:r>
+    </w:p>
+    <w:p/>
+    <w:p>
+      <w:pPr>
+        <w:pStyle w:val="Ttulo2"/>
+      </w:pPr>
+      <w:bookmarkStart w:id="21" w:name="_Toc240929554"/>
+      <w:r>
+        <w:t>User list with no connection</w:t>
+      </w:r>
+      <w:bookmarkEnd w:id="21"/>
+    </w:p>
+    <w:p>
+      <w:r>
+        <w:rPr>
+          <w:sz w:val="21"/>
+        </w:rPr>
+        <w:t xml:space="preserve">With the API unreachable, the view keeps showing the users stored on the device. The amber notice states that the data is local and gives the time of the last synchronisation, while the red message reports the connection failure: </w:t>
+      </w:r>
+      <w:r>
+        <w:rPr>
+          <w:b/>
+          <w:sz w:val="21"/>
+        </w:rPr>
+        <w:t>the cache does not hide the error</w:t>
+      </w:r>
+      <w:r>
+        <w:rPr>
+          <w:sz w:val="21"/>
+        </w:rPr>
+        <w:t>.</w:t>
+      </w:r>
+    </w:p>
+    <w:p>
+      <w:pPr>
+        <w:jc w:val="center"/>
+      </w:pPr>
+      <w:r>
+        <w:rPr>
+          <w:noProof/>
+        </w:rPr>
+        <w:drawing>
+          <wp:inline distT="0" distB="0" distL="0" distR="0" wp14:anchorId="4B9E3E2E" wp14:editId="10C45590">
+            <wp:extent cx="5120640" cy="2760345"/>
+            <wp:effectExtent l="0" t="0" r="0" b="0"/>
+            <wp:docPr id="14" name="Picture 14"/>
+            <wp:cNvGraphicFramePr>
+              <a:graphicFrameLocks xmlns:a="http://schemas.openxmlformats.org/drawingml/2006/main" noChangeAspect="1"/>
+            </wp:cNvGraphicFramePr>
+            <a:graphic xmlns:a="http://schemas.openxmlformats.org/drawingml/2006/main">
+              <a:graphicData uri="http://schemas.openxmlformats.org/drawingml/2006/picture">
+                <pic:pic xmlns:pic="http://schemas.openxmlformats.org/drawingml/2006/picture">
+                  <pic:nvPicPr>
+                    <pic:cNvPr id="0" name="20-usuarios-sin-conexion.png"/>
+                    <pic:cNvPicPr/>
+                  </pic:nvPicPr>
+                  <pic:blipFill>
+                    <a:blip r:embed="rId19"/>
+                    <a:stretch>
+                      <a:fillRect/>
+                    </a:stretch>
+                  </pic:blipFill>
+                  <pic:spPr>
+                    <a:xfrm>
+                      <a:off x="0" y="0"/>
+                      <a:ext cx="5120640" cy="2760345"/>
+                    </a:xfrm>
+                    <a:prstGeom prst="rect">
+                      <a:avLst/>
+                    </a:prstGeom>
+                  </pic:spPr>
+                </pic:pic>
+              </a:graphicData>
+            </a:graphic>
+          </wp:inline>
+        </w:drawing>
+      </w:r>
+    </w:p>
+    <w:p>
+      <w:pPr>
+        <w:jc w:val="center"/>
+      </w:pPr>
+      <w:r>
+        <w:rPr>
+          <w:i/>
+          <w:color w:val="555555"/>
+          <w:sz w:val="18"/>
+        </w:rPr>
+        <w:t>Figure 12. Users tab with the server unavailable.</w:t>
+      </w:r>
+    </w:p>
+    <w:p/>
+    <w:p>
+      <w:pPr>
+        <w:pStyle w:val="Ttulo1"/>
+      </w:pPr>
+      <w:bookmarkStart w:id="22" w:name="_Toc240929555"/>
       <w:r>
         <w:t>Technical Verification</w:t>
       </w:r>
-      <w:bookmarkEnd w:id="17"/>
+      <w:bookmarkEnd w:id="22"/>
     </w:p>
     <w:p>
       <w:r>
@@ -5774,23 +6849,68 @@
     </w:p>
     <w:p>
       <w:pPr>
-        <w:pStyle w:val="Ttulo1"/>
+        <w:pStyle w:val="Ttulo2"/>
       </w:pPr>
-      <w:bookmarkStart w:id="18" w:name="_Toc240928935"/>
-      <w:r>
-        <w:t>Files Delivered</w:t>
-      </w:r>
-      <w:bookmarkEnd w:id="18"/>
+      <w:bookmarkStart w:id="23" w:name="_Toc240929556"/>
+      <w:r>
+        <w:t>A bug found while capturing the screenshots</w:t>
+      </w:r>
+      <w:bookmarkEnd w:id="23"/>
     </w:p>
     <w:p>
-      <w:pPr>
-        <w:pStyle w:val="Ttulo2"/>
-      </w:pPr>
-      <w:bookmarkStart w:id="19" w:name="_Toc240928936"/>
-      <w:r>
-        <w:t>New files</w:t>
-      </w:r>
-      <w:bookmarkEnd w:id="19"/>
+      <w:r>
+        <w:rPr>
+          <w:sz w:val="21"/>
+        </w:rPr>
+        <w:t>Taking the screenshots was not merely documentation work: it exposed a real defect. The session was being stored correctly, but on reopening the application the login form appeared again, as if nothing had been saved.</w:t>
+      </w:r>
+    </w:p>
+    <w:p>
+      <w:r>
+        <w:rPr>
+          <w:sz w:val="21"/>
+        </w:rPr>
+        <w:t xml:space="preserve">The cause was </w:t>
+      </w:r>
+      <w:r>
+        <w:rPr>
+          <w:b/>
+          <w:sz w:val="21"/>
+        </w:rPr>
+        <w:t>not</w:t>
+      </w:r>
+      <w:r>
+        <w:rPr>
+          <w:sz w:val="21"/>
+        </w:rPr>
+        <w:t xml:space="preserve"> in the persistence layer. </w:t>
+      </w:r>
+      <w:r>
+        <w:rPr>
+          <w:rFonts w:ascii="Consolas" w:hAnsi="Consolas"/>
+          <w:sz w:val="19"/>
+        </w:rPr>
+        <w:t>Tab1Page</w:t>
+      </w:r>
+      <w:r>
+        <w:rPr>
+          <w:sz w:val="21"/>
+        </w:rPr>
+        <w:t xml:space="preserve"> kept </w:t>
+      </w:r>
+      <w:r>
+        <w:rPr>
+          <w:rFonts w:ascii="Consolas" w:hAnsi="Consolas"/>
+          <w:sz w:val="19"/>
+        </w:rPr>
+        <w:t>isActive</w:t>
+      </w:r>
+      <w:r>
+        <w:rPr>
+          <w:sz w:val="21"/>
+        </w:rPr>
+        <w:t xml:space="preserve"> as a plain property:</w:t>
+      </w:r>
     </w:p>
     <w:tbl>
       <w:tblPr>
@@ -5819,7 +6939,7 @@
                 <w:rFonts w:ascii="Consolas" w:hAnsi="Consolas"/>
                 <w:sz w:val="17"/>
               </w:rPr>
-              <w:t>src/app/models/nota.model.ts           Entidad Nota y tipos derivados</w:t>
+              <w:t>isActive = false;            // antes</w:t>
             </w:r>
           </w:p>
           <w:p>
@@ -5831,7 +6951,7 @@
                 <w:rFonts w:ascii="Consolas" w:hAnsi="Consolas"/>
                 <w:sz w:val="17"/>
               </w:rPr>
-              <w:t>src/app/services/storage.service.ts    Envoltura de Preferences</w:t>
+              <w:t>...</w:t>
             </w:r>
           </w:p>
           <w:p>
@@ -5843,67 +6963,7 @@
                 <w:rFonts w:ascii="Consolas" w:hAnsi="Consolas"/>
                 <w:sz w:val="17"/>
               </w:rPr>
-              <w:t>src/app/services/sesion.service.ts     Sesion persistente</w:t>
-            </w:r>
-          </w:p>
-          <w:p>
-            <w:pPr>
-              <w:spacing w:after="0"/>
-            </w:pPr>
-            <w:r>
-              <w:rPr>
-                <w:rFonts w:ascii="Consolas" w:hAnsi="Consolas"/>
-                <w:sz w:val="17"/>
-              </w:rPr>
-              <w:t>src/app/services/nota.repository.ts    CRUD contra el dispositivo</w:t>
-            </w:r>
-          </w:p>
-          <w:p>
-            <w:pPr>
-              <w:spacing w:after="0"/>
-            </w:pPr>
-            <w:r>
-              <w:rPr>
-                <w:rFonts w:ascii="Consolas" w:hAnsi="Consolas"/>
-                <w:sz w:val="17"/>
-              </w:rPr>
-              <w:t>src/app/services/nota.repository.spec.ts  Pruebas del repositorio</w:t>
-            </w:r>
-          </w:p>
-          <w:p>
-            <w:pPr>
-              <w:spacing w:after="0"/>
-            </w:pPr>
-            <w:r>
-              <w:rPr>
-                <w:rFonts w:ascii="Consolas" w:hAnsi="Consolas"/>
-                <w:sz w:val="17"/>
-              </w:rPr>
-              <w:t>src/app/tab4/tab4.page.ts              Vista del CRUD de notas</w:t>
-            </w:r>
-          </w:p>
-          <w:p>
-            <w:pPr>
-              <w:spacing w:after="0"/>
-            </w:pPr>
-            <w:r>
-              <w:rPr>
-                <w:rFonts w:ascii="Consolas" w:hAnsi="Consolas"/>
-                <w:sz w:val="17"/>
-              </w:rPr>
-              <w:t>src/app/tab4/tab4.page.html</w:t>
-            </w:r>
-          </w:p>
-          <w:p>
-            <w:pPr>
-              <w:spacing w:after="0"/>
-            </w:pPr>
-            <w:r>
-              <w:rPr>
-                <w:rFonts w:ascii="Consolas" w:hAnsi="Consolas"/>
-                <w:sz w:val="17"/>
-              </w:rPr>
-              <w:t>src/app/tab4/tab4.page.scss</w:t>
+              <w:t>this.isActive = true;        // despues de un await</w:t>
             </w:r>
           </w:p>
         </w:tc>
@@ -5911,14 +6971,38 @@
     </w:tbl>
     <w:p/>
     <w:p>
-      <w:pPr>
-        <w:pStyle w:val="Ttulo2"/>
-      </w:pPr>
-      <w:bookmarkStart w:id="20" w:name="_Toc240928937"/>
-      <w:r>
-        <w:t>Modified files</w:t>
-      </w:r>
-      <w:bookmarkEnd w:id="20"/>
+      <w:r>
+        <w:rPr>
+          <w:sz w:val="21"/>
+        </w:rPr>
+        <w:t xml:space="preserve">The application is </w:t>
+      </w:r>
+      <w:r>
+        <w:rPr>
+          <w:b/>
+          <w:sz w:val="21"/>
+        </w:rPr>
+        <w:t>zoneless</w:t>
+      </w:r>
+      <w:r>
+        <w:rPr>
+          <w:sz w:val="21"/>
+        </w:rPr>
+        <w:t xml:space="preserve">, so Angular does not watch plain properties. </w:t>
+      </w:r>
+      <w:r>
+        <w:rPr>
+          <w:rFonts w:ascii="Consolas" w:hAnsi="Consolas"/>
+          <w:sz w:val="19"/>
+        </w:rPr>
+        <w:t>restaurar()</w:t>
+      </w:r>
+      <w:r>
+        <w:rPr>
+          <w:sz w:val="21"/>
+        </w:rPr>
+        <w:t xml:space="preserve"> resolves asynchronously, and by the time the value changed Angular was no longer observing: the state was correct in memory but the view was never repainted. The fix was to turn it into a signal, which is what the rest of the component already used:</w:t>
+      </w:r>
     </w:p>
     <w:tbl>
       <w:tblPr>
@@ -5947,7 +7031,7 @@
                 <w:rFonts w:ascii="Consolas" w:hAnsi="Consolas"/>
                 <w:sz w:val="17"/>
               </w:rPr>
-              <w:t>src/app/models/index.ts                Exporta el modelo Nota</w:t>
+              <w:t>isActive = signal(false);    // despues</w:t>
             </w:r>
           </w:p>
           <w:p>
@@ -5959,7 +7043,7 @@
                 <w:rFonts w:ascii="Consolas" w:hAnsi="Consolas"/>
                 <w:sz w:val="17"/>
               </w:rPr>
-              <w:t>src/app/services/usuario.repository.ts Cache offline de la lista</w:t>
+              <w:t>...</w:t>
             </w:r>
           </w:p>
           <w:p>
@@ -5971,79 +7055,7 @@
                 <w:rFonts w:ascii="Consolas" w:hAnsi="Consolas"/>
                 <w:sz w:val="17"/>
               </w:rPr>
-              <w:t>src/app/tab1/tab1.page.ts              Restaura y guarda la sesion</w:t>
-            </w:r>
-          </w:p>
-          <w:p>
-            <w:pPr>
-              <w:spacing w:after="0"/>
-            </w:pPr>
-            <w:r>
-              <w:rPr>
-                <w:rFonts w:ascii="Consolas" w:hAnsi="Consolas"/>
-                <w:sz w:val="17"/>
-              </w:rPr>
-              <w:t>src/app/tab3/tab3.page.ts              Carga la cache y su estado</w:t>
-            </w:r>
-          </w:p>
-          <w:p>
-            <w:pPr>
-              <w:spacing w:after="0"/>
-            </w:pPr>
-            <w:r>
-              <w:rPr>
-                <w:rFonts w:ascii="Consolas" w:hAnsi="Consolas"/>
-                <w:sz w:val="17"/>
-              </w:rPr>
-              <w:t>src/app/tab3/tab3.page.html            Aviso de datos sin conexion</w:t>
-            </w:r>
-          </w:p>
-          <w:p>
-            <w:pPr>
-              <w:spacing w:after="0"/>
-            </w:pPr>
-            <w:r>
-              <w:rPr>
-                <w:rFonts w:ascii="Consolas" w:hAnsi="Consolas"/>
-                <w:sz w:val="17"/>
-              </w:rPr>
-              <w:t>src/app/tab3/tab3.page.scss            Estilo del aviso</w:t>
-            </w:r>
-          </w:p>
-          <w:p>
-            <w:pPr>
-              <w:spacing w:after="0"/>
-            </w:pPr>
-            <w:r>
-              <w:rPr>
-                <w:rFonts w:ascii="Consolas" w:hAnsi="Consolas"/>
-                <w:sz w:val="17"/>
-              </w:rPr>
-              <w:t>src/app/tabs/tabs.routes.ts            Ruta /tabs/tab4</w:t>
-            </w:r>
-          </w:p>
-          <w:p>
-            <w:pPr>
-              <w:spacing w:after="0"/>
-            </w:pPr>
-            <w:r>
-              <w:rPr>
-                <w:rFonts w:ascii="Consolas" w:hAnsi="Consolas"/>
-                <w:sz w:val="17"/>
-              </w:rPr>
-              <w:t>src/app/tabs/tabs.page.html            Boton de la pestana Notas</w:t>
-            </w:r>
-          </w:p>
-          <w:p>
-            <w:pPr>
-              <w:spacing w:after="0"/>
-            </w:pPr>
-            <w:r>
-              <w:rPr>
-                <w:rFonts w:ascii="Consolas" w:hAnsi="Consolas"/>
-                <w:sz w:val="17"/>
-              </w:rPr>
-              <w:t>src/app/tabs/tabs.page.ts              Icono document-text</w:t>
+              <w:t>this.isActive.set(true);</w:t>
             </w:r>
           </w:p>
         </w:tc>
@@ -6051,14 +7063,45 @@
     </w:tbl>
     <w:p/>
     <w:p>
+      <w:r>
+        <w:rPr>
+          <w:sz w:val="21"/>
+        </w:rPr>
+        <w:t xml:space="preserve">It is worth noting that the code's own comment already warned about this (*"se usan signals porque la app es zoneless"*), and the rule was still broken on the two properties inherited from the original template. A defect of this kind does not show up in a build or in a unit test of the repository: </w:t>
+      </w:r>
+      <w:r>
+        <w:rPr>
+          <w:b/>
+          <w:sz w:val="21"/>
+        </w:rPr>
+        <w:t>only running the application reveals it</w:t>
+      </w:r>
+      <w:r>
+        <w:rPr>
+          <w:sz w:val="21"/>
+        </w:rPr>
+        <w:t>.</w:t>
+      </w:r>
+    </w:p>
+    <w:p>
+      <w:pPr>
+        <w:pStyle w:val="Ttulo1"/>
+      </w:pPr>
+      <w:bookmarkStart w:id="24" w:name="_Toc240929557"/>
+      <w:r>
+        <w:t>Files Delivered</w:t>
+      </w:r>
+      <w:bookmarkEnd w:id="24"/>
+    </w:p>
+    <w:p>
       <w:pPr>
         <w:pStyle w:val="Ttulo2"/>
       </w:pPr>
-      <w:bookmarkStart w:id="21" w:name="_Toc240928938"/>
-      <w:r>
-        <w:t>Resulting structure</w:t>
-      </w:r>
-      <w:bookmarkEnd w:id="21"/>
+      <w:bookmarkStart w:id="25" w:name="_Toc240929558"/>
+      <w:r>
+        <w:t>New files</w:t>
+      </w:r>
+      <w:bookmarkEnd w:id="25"/>
     </w:p>
     <w:tbl>
       <w:tblPr>
@@ -6087,7 +7130,7 @@
                 <w:rFonts w:ascii="Consolas" w:hAnsi="Consolas"/>
                 <w:sz w:val="17"/>
               </w:rPr>
-              <w:t>src/app/</w:t>
+              <w:t>src/app/models/nota.model.ts           Entidad Nota y tipos derivados</w:t>
             </w:r>
           </w:p>
           <w:p>
@@ -6099,7 +7142,7 @@
                 <w:rFonts w:ascii="Consolas" w:hAnsi="Consolas"/>
                 <w:sz w:val="17"/>
               </w:rPr>
-              <w:t>|-- models/</w:t>
+              <w:t>src/app/services/storage.service.ts    Envoltura de Preferences</w:t>
             </w:r>
           </w:p>
           <w:p>
@@ -6111,7 +7154,7 @@
                 <w:rFonts w:ascii="Consolas" w:hAnsi="Consolas"/>
                 <w:sz w:val="17"/>
               </w:rPr>
-              <w:t>|   |-- usuario.model.ts</w:t>
+              <w:t>src/app/services/sesion.service.ts     Sesion persistente</w:t>
             </w:r>
           </w:p>
           <w:p>
@@ -6123,7 +7166,7 @@
                 <w:rFonts w:ascii="Consolas" w:hAnsi="Consolas"/>
                 <w:sz w:val="17"/>
               </w:rPr>
-              <w:t>|   |-- foto.model.ts</w:t>
+              <w:t>src/app/services/nota.repository.ts    CRUD contra el dispositivo</w:t>
             </w:r>
           </w:p>
           <w:p>
@@ -6135,7 +7178,7 @@
                 <w:rFonts w:ascii="Consolas" w:hAnsi="Consolas"/>
                 <w:sz w:val="17"/>
               </w:rPr>
-              <w:t>|   |-- nota.model.ts             &lt;-- nuevo</w:t>
+              <w:t>src/app/services/nota.repository.spec.ts  Pruebas del repositorio</w:t>
             </w:r>
           </w:p>
           <w:p>
@@ -6147,7 +7190,7 @@
                 <w:rFonts w:ascii="Consolas" w:hAnsi="Consolas"/>
                 <w:sz w:val="17"/>
               </w:rPr>
-              <w:t>|   |-- respuesta-api.model.ts</w:t>
+              <w:t>src/app/tab4/tab4.page.ts              Vista del CRUD de notas</w:t>
             </w:r>
           </w:p>
           <w:p>
@@ -6159,7 +7202,7 @@
                 <w:rFonts w:ascii="Consolas" w:hAnsi="Consolas"/>
                 <w:sz w:val="17"/>
               </w:rPr>
-              <w:t>|   +-- index.ts</w:t>
+              <w:t>src/app/tab4/tab4.page.html</w:t>
             </w:r>
           </w:p>
           <w:p>
@@ -6171,127 +7214,7 @@
                 <w:rFonts w:ascii="Consolas" w:hAnsi="Consolas"/>
                 <w:sz w:val="17"/>
               </w:rPr>
-              <w:t>|-- services/</w:t>
-            </w:r>
-          </w:p>
-          <w:p>
-            <w:pPr>
-              <w:spacing w:after="0"/>
-            </w:pPr>
-            <w:r>
-              <w:rPr>
-                <w:rFonts w:ascii="Consolas" w:hAnsi="Consolas"/>
-                <w:sz w:val="17"/>
-              </w:rPr>
-              <w:t>|   |-- http.service.ts             transporte HTTP</w:t>
-            </w:r>
-          </w:p>
-          <w:p>
-            <w:pPr>
-              <w:spacing w:after="0"/>
-            </w:pPr>
-            <w:r>
-              <w:rPr>
-                <w:rFonts w:ascii="Consolas" w:hAnsi="Consolas"/>
-                <w:sz w:val="17"/>
-              </w:rPr>
-              <w:t>|   |-- storage.service.ts        &lt;-- nuevo: persistencia local</w:t>
-            </w:r>
-          </w:p>
-          <w:p>
-            <w:pPr>
-              <w:spacing w:after="0"/>
-            </w:pPr>
-            <w:r>
-              <w:rPr>
-                <w:rFonts w:ascii="Consolas" w:hAnsi="Consolas"/>
-                <w:sz w:val="17"/>
-              </w:rPr>
-              <w:t>|   |-- sesion.service.ts         &lt;-- nuevo: sesion</w:t>
-            </w:r>
-          </w:p>
-          <w:p>
-            <w:pPr>
-              <w:spacing w:after="0"/>
-            </w:pPr>
-            <w:r>
-              <w:rPr>
-                <w:rFonts w:ascii="Consolas" w:hAnsi="Consolas"/>
-                <w:sz w:val="17"/>
-              </w:rPr>
-              <w:t>|   |-- usuario.repository.ts       entidad + cache offline</w:t>
-            </w:r>
-          </w:p>
-          <w:p>
-            <w:pPr>
-              <w:spacing w:after="0"/>
-            </w:pPr>
-            <w:r>
-              <w:rPr>
-                <w:rFonts w:ascii="Consolas" w:hAnsi="Consolas"/>
-                <w:sz w:val="17"/>
-              </w:rPr>
-              <w:t>|   |-- nota.repository.ts        &lt;-- nuevo: entidad local</w:t>
-            </w:r>
-          </w:p>
-          <w:p>
-            <w:pPr>
-              <w:spacing w:after="0"/>
-            </w:pPr>
-            <w:r>
-              <w:rPr>
-                <w:rFonts w:ascii="Consolas" w:hAnsi="Consolas"/>
-                <w:sz w:val="17"/>
-              </w:rPr>
-              <w:t>|   +-- photo.service.ts            galeria (ya persistia)</w:t>
-            </w:r>
-          </w:p>
-          <w:p>
-            <w:pPr>
-              <w:spacing w:after="0"/>
-            </w:pPr>
-            <w:r>
-              <w:rPr>
-                <w:rFonts w:ascii="Consolas" w:hAnsi="Consolas"/>
-                <w:sz w:val="17"/>
-              </w:rPr>
-              <w:t>|-- tab1/   Acceso (sesion persistente)</w:t>
-            </w:r>
-          </w:p>
-          <w:p>
-            <w:pPr>
-              <w:spacing w:after="0"/>
-            </w:pPr>
-            <w:r>
-              <w:rPr>
-                <w:rFonts w:ascii="Consolas" w:hAnsi="Consolas"/>
-                <w:sz w:val="17"/>
-              </w:rPr>
-              <w:t>|-- tab2/   Galeria de fotos</w:t>
-            </w:r>
-          </w:p>
-          <w:p>
-            <w:pPr>
-              <w:spacing w:after="0"/>
-            </w:pPr>
-            <w:r>
-              <w:rPr>
-                <w:rFonts w:ascii="Consolas" w:hAnsi="Consolas"/>
-                <w:sz w:val="17"/>
-              </w:rPr>
-              <w:t>|-- tab3/   CRUD de usuarios (con cache offline)</w:t>
-            </w:r>
-          </w:p>
-          <w:p>
-            <w:pPr>
-              <w:spacing w:after="0"/>
-            </w:pPr>
-            <w:r>
-              <w:rPr>
-                <w:rFonts w:ascii="Consolas" w:hAnsi="Consolas"/>
-                <w:sz w:val="17"/>
-              </w:rPr>
-              <w:t>+-- tab4/   CRUD de notas (100% local)   &lt;-- nuevo</w:t>
+              <w:t>src/app/tab4/tab4.page.scss</w:t>
             </w:r>
           </w:p>
         </w:tc>
@@ -6302,70 +7225,11 @@
       <w:pPr>
         <w:pStyle w:val="Ttulo2"/>
       </w:pPr>
-      <w:bookmarkStart w:id="22" w:name="_Toc240928939"/>
-      <w:r>
-        <w:t>Version control</w:t>
-      </w:r>
-      <w:bookmarkEnd w:id="22"/>
-    </w:p>
-    <w:p>
-      <w:r>
-        <w:rPr>
-          <w:sz w:val="21"/>
-        </w:rPr>
-        <w:t xml:space="preserve">Repository: </w:t>
-      </w:r>
-      <w:r>
-        <w:rPr>
-          <w:b/>
-          <w:sz w:val="21"/>
-        </w:rPr>
-        <w:t>https://github.com/David-Martinez-Mercado/APPIonic</w:t>
-      </w:r>
-    </w:p>
-    <w:p>
-      <w:r>
-        <w:rPr>
-          <w:sz w:val="21"/>
-        </w:rPr>
-        <w:t xml:space="preserve">Commit of this delivery: </w:t>
-      </w:r>
-      <w:r>
-        <w:rPr>
-          <w:rFonts w:ascii="Consolas" w:hAnsi="Consolas"/>
-          <w:sz w:val="19"/>
-        </w:rPr>
-        <w:t>c93b9cb</w:t>
-      </w:r>
-      <w:r>
-        <w:rPr>
-          <w:sz w:val="21"/>
-        </w:rPr>
-        <w:t xml:space="preserve"> — </w:t>
-      </w:r>
-      <w:r>
-        <w:rPr>
-          <w:i/>
-          <w:sz w:val="21"/>
-        </w:rPr>
-        <w:t>feat: persistencia local con Capacitor Preferences</w:t>
-      </w:r>
-      <w:r>
-        <w:rPr>
-          <w:sz w:val="21"/>
-        </w:rPr>
-        <w:t xml:space="preserve"> (20 files changed, 1835 insertions).</w:t>
-      </w:r>
-    </w:p>
-    <w:p>
-      <w:pPr>
-        <w:pStyle w:val="Ttulo2"/>
-      </w:pPr>
-      <w:bookmarkStart w:id="23" w:name="_Toc240928940"/>
-      <w:r>
-        <w:t>How to run it</w:t>
-      </w:r>
-      <w:bookmarkEnd w:id="23"/>
+      <w:bookmarkStart w:id="26" w:name="_Toc240929559"/>
+      <w:r>
+        <w:t>Modified files</w:t>
+      </w:r>
+      <w:bookmarkEnd w:id="26"/>
     </w:p>
     <w:tbl>
       <w:tblPr>
@@ -6394,6 +7258,453 @@
                 <w:rFonts w:ascii="Consolas" w:hAnsi="Consolas"/>
                 <w:sz w:val="17"/>
               </w:rPr>
+              <w:t>src/app/models/index.ts                Exporta el modelo Nota</w:t>
+            </w:r>
+          </w:p>
+          <w:p>
+            <w:pPr>
+              <w:spacing w:after="0"/>
+            </w:pPr>
+            <w:r>
+              <w:rPr>
+                <w:rFonts w:ascii="Consolas" w:hAnsi="Consolas"/>
+                <w:sz w:val="17"/>
+              </w:rPr>
+              <w:t>src/app/services/usuario.repository.ts Cache offline de la lista</w:t>
+            </w:r>
+          </w:p>
+          <w:p>
+            <w:pPr>
+              <w:spacing w:after="0"/>
+            </w:pPr>
+            <w:r>
+              <w:rPr>
+                <w:rFonts w:ascii="Consolas" w:hAnsi="Consolas"/>
+                <w:sz w:val="17"/>
+              </w:rPr>
+              <w:t>src/app/tab1/tab1.page.ts              Restaura y guarda la sesion</w:t>
+            </w:r>
+          </w:p>
+          <w:p>
+            <w:pPr>
+              <w:spacing w:after="0"/>
+            </w:pPr>
+            <w:r>
+              <w:rPr>
+                <w:rFonts w:ascii="Consolas" w:hAnsi="Consolas"/>
+                <w:sz w:val="17"/>
+              </w:rPr>
+              <w:t>src/app/tab3/tab3.page.ts              Carga la cache y su estado</w:t>
+            </w:r>
+          </w:p>
+          <w:p>
+            <w:pPr>
+              <w:spacing w:after="0"/>
+            </w:pPr>
+            <w:r>
+              <w:rPr>
+                <w:rFonts w:ascii="Consolas" w:hAnsi="Consolas"/>
+                <w:sz w:val="17"/>
+              </w:rPr>
+              <w:t>src/app/tab3/tab3.page.html            Aviso de datos sin conexion</w:t>
+            </w:r>
+          </w:p>
+          <w:p>
+            <w:pPr>
+              <w:spacing w:after="0"/>
+            </w:pPr>
+            <w:r>
+              <w:rPr>
+                <w:rFonts w:ascii="Consolas" w:hAnsi="Consolas"/>
+                <w:sz w:val="17"/>
+              </w:rPr>
+              <w:t>src/app/tab3/tab3.page.scss            Estilo del aviso</w:t>
+            </w:r>
+          </w:p>
+          <w:p>
+            <w:pPr>
+              <w:spacing w:after="0"/>
+            </w:pPr>
+            <w:r>
+              <w:rPr>
+                <w:rFonts w:ascii="Consolas" w:hAnsi="Consolas"/>
+                <w:sz w:val="17"/>
+              </w:rPr>
+              <w:t>src/app/tabs/tabs.routes.ts            Ruta /tabs/tab4</w:t>
+            </w:r>
+          </w:p>
+          <w:p>
+            <w:pPr>
+              <w:spacing w:after="0"/>
+            </w:pPr>
+            <w:r>
+              <w:rPr>
+                <w:rFonts w:ascii="Consolas" w:hAnsi="Consolas"/>
+                <w:sz w:val="17"/>
+              </w:rPr>
+              <w:t>src/app/tabs/tabs.page.html            Boton de la pestana Notas</w:t>
+            </w:r>
+          </w:p>
+          <w:p>
+            <w:pPr>
+              <w:spacing w:after="0"/>
+            </w:pPr>
+            <w:r>
+              <w:rPr>
+                <w:rFonts w:ascii="Consolas" w:hAnsi="Consolas"/>
+                <w:sz w:val="17"/>
+              </w:rPr>
+              <w:t>src/app/tabs/tabs.page.ts              Icono document-text</w:t>
+            </w:r>
+          </w:p>
+        </w:tc>
+      </w:tr>
+    </w:tbl>
+    <w:p/>
+    <w:p>
+      <w:pPr>
+        <w:pStyle w:val="Ttulo2"/>
+      </w:pPr>
+      <w:bookmarkStart w:id="27" w:name="_Toc240929560"/>
+      <w:r>
+        <w:t>Resulting structure</w:t>
+      </w:r>
+      <w:bookmarkEnd w:id="27"/>
+    </w:p>
+    <w:tbl>
+      <w:tblPr>
+        <w:tblW w:w="0" w:type="auto"/>
+        <w:jc w:val="center"/>
+        <w:tblLook w:val="04A0" w:firstRow="1" w:lastRow="0" w:firstColumn="1" w:lastColumn="0" w:noHBand="0" w:noVBand="1"/>
+      </w:tblPr>
+      <w:tblGrid>
+        <w:gridCol w:w="9360"/>
+      </w:tblGrid>
+      <w:tr>
+        <w:trPr>
+          <w:jc w:val="center"/>
+        </w:trPr>
+        <w:tc>
+          <w:tcPr>
+            <w:tcW w:w="9360" w:type="dxa"/>
+            <w:shd w:val="clear" w:color="auto" w:fill="F2F2F2"/>
+          </w:tcPr>
+          <w:p>
+            <w:pPr>
+              <w:spacing w:after="0"/>
+            </w:pPr>
+            <w:r>
+              <w:rPr>
+                <w:rFonts w:ascii="Consolas" w:hAnsi="Consolas"/>
+                <w:sz w:val="17"/>
+              </w:rPr>
+              <w:t>src/app/</w:t>
+            </w:r>
+          </w:p>
+          <w:p>
+            <w:pPr>
+              <w:spacing w:after="0"/>
+            </w:pPr>
+            <w:r>
+              <w:rPr>
+                <w:rFonts w:ascii="Consolas" w:hAnsi="Consolas"/>
+                <w:sz w:val="17"/>
+              </w:rPr>
+              <w:t>|-- models/</w:t>
+            </w:r>
+          </w:p>
+          <w:p>
+            <w:pPr>
+              <w:spacing w:after="0"/>
+            </w:pPr>
+            <w:r>
+              <w:rPr>
+                <w:rFonts w:ascii="Consolas" w:hAnsi="Consolas"/>
+                <w:sz w:val="17"/>
+              </w:rPr>
+              <w:t>|   |-- usuario.model.ts</w:t>
+            </w:r>
+          </w:p>
+          <w:p>
+            <w:pPr>
+              <w:spacing w:after="0"/>
+            </w:pPr>
+            <w:r>
+              <w:rPr>
+                <w:rFonts w:ascii="Consolas" w:hAnsi="Consolas"/>
+                <w:sz w:val="17"/>
+              </w:rPr>
+              <w:t>|   |-- foto.model.ts</w:t>
+            </w:r>
+          </w:p>
+          <w:p>
+            <w:pPr>
+              <w:spacing w:after="0"/>
+            </w:pPr>
+            <w:r>
+              <w:rPr>
+                <w:rFonts w:ascii="Consolas" w:hAnsi="Consolas"/>
+                <w:sz w:val="17"/>
+              </w:rPr>
+              <w:t>|   |-- nota.model.ts             &lt;-- nuevo</w:t>
+            </w:r>
+          </w:p>
+          <w:p>
+            <w:pPr>
+              <w:spacing w:after="0"/>
+            </w:pPr>
+            <w:r>
+              <w:rPr>
+                <w:rFonts w:ascii="Consolas" w:hAnsi="Consolas"/>
+                <w:sz w:val="17"/>
+              </w:rPr>
+              <w:t>|   |-- respuesta-api.model.ts</w:t>
+            </w:r>
+          </w:p>
+          <w:p>
+            <w:pPr>
+              <w:spacing w:after="0"/>
+            </w:pPr>
+            <w:r>
+              <w:rPr>
+                <w:rFonts w:ascii="Consolas" w:hAnsi="Consolas"/>
+                <w:sz w:val="17"/>
+              </w:rPr>
+              <w:t>|   +-- index.ts</w:t>
+            </w:r>
+          </w:p>
+          <w:p>
+            <w:pPr>
+              <w:spacing w:after="0"/>
+            </w:pPr>
+            <w:r>
+              <w:rPr>
+                <w:rFonts w:ascii="Consolas" w:hAnsi="Consolas"/>
+                <w:sz w:val="17"/>
+              </w:rPr>
+              <w:t>|-- services/</w:t>
+            </w:r>
+          </w:p>
+          <w:p>
+            <w:pPr>
+              <w:spacing w:after="0"/>
+            </w:pPr>
+            <w:r>
+              <w:rPr>
+                <w:rFonts w:ascii="Consolas" w:hAnsi="Consolas"/>
+                <w:sz w:val="17"/>
+              </w:rPr>
+              <w:t>|   |-- http.service.ts             transporte HTTP</w:t>
+            </w:r>
+          </w:p>
+          <w:p>
+            <w:pPr>
+              <w:spacing w:after="0"/>
+            </w:pPr>
+            <w:r>
+              <w:rPr>
+                <w:rFonts w:ascii="Consolas" w:hAnsi="Consolas"/>
+                <w:sz w:val="17"/>
+              </w:rPr>
+              <w:t>|   |-- storage.service.ts        &lt;-- nuevo: persistencia local</w:t>
+            </w:r>
+          </w:p>
+          <w:p>
+            <w:pPr>
+              <w:spacing w:after="0"/>
+            </w:pPr>
+            <w:r>
+              <w:rPr>
+                <w:rFonts w:ascii="Consolas" w:hAnsi="Consolas"/>
+                <w:sz w:val="17"/>
+              </w:rPr>
+              <w:t>|   |-- sesion.service.ts         &lt;-- nuevo: sesion</w:t>
+            </w:r>
+          </w:p>
+          <w:p>
+            <w:pPr>
+              <w:spacing w:after="0"/>
+            </w:pPr>
+            <w:r>
+              <w:rPr>
+                <w:rFonts w:ascii="Consolas" w:hAnsi="Consolas"/>
+                <w:sz w:val="17"/>
+              </w:rPr>
+              <w:t>|   |-- usuario.repository.ts       entidad + cache offline</w:t>
+            </w:r>
+          </w:p>
+          <w:p>
+            <w:pPr>
+              <w:spacing w:after="0"/>
+            </w:pPr>
+            <w:r>
+              <w:rPr>
+                <w:rFonts w:ascii="Consolas" w:hAnsi="Consolas"/>
+                <w:sz w:val="17"/>
+              </w:rPr>
+              <w:t>|   |-- nota.repository.ts        &lt;-- nuevo: entidad local</w:t>
+            </w:r>
+          </w:p>
+          <w:p>
+            <w:pPr>
+              <w:spacing w:after="0"/>
+            </w:pPr>
+            <w:r>
+              <w:rPr>
+                <w:rFonts w:ascii="Consolas" w:hAnsi="Consolas"/>
+                <w:sz w:val="17"/>
+              </w:rPr>
+              <w:t>|   +-- photo.service.ts            galeria (ya persistia)</w:t>
+            </w:r>
+          </w:p>
+          <w:p>
+            <w:pPr>
+              <w:spacing w:after="0"/>
+            </w:pPr>
+            <w:r>
+              <w:rPr>
+                <w:rFonts w:ascii="Consolas" w:hAnsi="Consolas"/>
+                <w:sz w:val="17"/>
+              </w:rPr>
+              <w:t>|-- tab1/   Acceso (sesion persistente)</w:t>
+            </w:r>
+          </w:p>
+          <w:p>
+            <w:pPr>
+              <w:spacing w:after="0"/>
+            </w:pPr>
+            <w:r>
+              <w:rPr>
+                <w:rFonts w:ascii="Consolas" w:hAnsi="Consolas"/>
+                <w:sz w:val="17"/>
+              </w:rPr>
+              <w:t>|-- tab2/   Galeria de fotos</w:t>
+            </w:r>
+          </w:p>
+          <w:p>
+            <w:pPr>
+              <w:spacing w:after="0"/>
+            </w:pPr>
+            <w:r>
+              <w:rPr>
+                <w:rFonts w:ascii="Consolas" w:hAnsi="Consolas"/>
+                <w:sz w:val="17"/>
+              </w:rPr>
+              <w:t>|-- tab3/   CRUD de usuarios (con cache offline)</w:t>
+            </w:r>
+          </w:p>
+          <w:p>
+            <w:pPr>
+              <w:spacing w:after="0"/>
+            </w:pPr>
+            <w:r>
+              <w:rPr>
+                <w:rFonts w:ascii="Consolas" w:hAnsi="Consolas"/>
+                <w:sz w:val="17"/>
+              </w:rPr>
+              <w:t>+-- tab4/   CRUD de notas (100% local)   &lt;-- nuevo</w:t>
+            </w:r>
+          </w:p>
+        </w:tc>
+      </w:tr>
+    </w:tbl>
+    <w:p/>
+    <w:p>
+      <w:pPr>
+        <w:pStyle w:val="Ttulo2"/>
+      </w:pPr>
+      <w:bookmarkStart w:id="28" w:name="_Toc240929561"/>
+      <w:r>
+        <w:t>Version control</w:t>
+      </w:r>
+      <w:bookmarkEnd w:id="28"/>
+    </w:p>
+    <w:p>
+      <w:r>
+        <w:rPr>
+          <w:sz w:val="21"/>
+        </w:rPr>
+        <w:t xml:space="preserve">Repository: </w:t>
+      </w:r>
+      <w:r>
+        <w:rPr>
+          <w:b/>
+          <w:sz w:val="21"/>
+        </w:rPr>
+        <w:t>https://github.com/David-Martinez-Mercado/APPIonic</w:t>
+      </w:r>
+    </w:p>
+    <w:p>
+      <w:r>
+        <w:rPr>
+          <w:sz w:val="21"/>
+        </w:rPr>
+        <w:t xml:space="preserve">Commit of this delivery: </w:t>
+      </w:r>
+      <w:r>
+        <w:rPr>
+          <w:rFonts w:ascii="Consolas" w:hAnsi="Consolas"/>
+          <w:sz w:val="19"/>
+        </w:rPr>
+        <w:t>c93b9cb</w:t>
+      </w:r>
+      <w:r>
+        <w:rPr>
+          <w:sz w:val="21"/>
+        </w:rPr>
+        <w:t xml:space="preserve"> — </w:t>
+      </w:r>
+      <w:r>
+        <w:rPr>
+          <w:i/>
+          <w:sz w:val="21"/>
+        </w:rPr>
+        <w:t>feat: persistencia local con Capacitor Preferences</w:t>
+      </w:r>
+      <w:r>
+        <w:rPr>
+          <w:sz w:val="21"/>
+        </w:rPr>
+        <w:t xml:space="preserve"> (20 files changed, 1835 insertions).</w:t>
+      </w:r>
+    </w:p>
+    <w:p>
+      <w:pPr>
+        <w:pStyle w:val="Ttulo2"/>
+      </w:pPr>
+      <w:bookmarkStart w:id="29" w:name="_Toc240929562"/>
+      <w:r>
+        <w:t>How to run it</w:t>
+      </w:r>
+      <w:bookmarkEnd w:id="29"/>
+    </w:p>
+    <w:tbl>
+      <w:tblPr>
+        <w:tblW w:w="0" w:type="auto"/>
+        <w:jc w:val="center"/>
+        <w:tblLook w:val="04A0" w:firstRow="1" w:lastRow="0" w:firstColumn="1" w:lastColumn="0" w:noHBand="0" w:noVBand="1"/>
+      </w:tblPr>
+      <w:tblGrid>
+        <w:gridCol w:w="9360"/>
+      </w:tblGrid>
+      <w:tr>
+        <w:trPr>
+          <w:jc w:val="center"/>
+        </w:trPr>
+        <w:tc>
+          <w:tcPr>
+            <w:tcW w:w="9360" w:type="dxa"/>
+            <w:shd w:val="clear" w:color="auto" w:fill="F2F2F2"/>
+          </w:tcPr>
+          <w:p>
+            <w:pPr>
+              <w:spacing w:after="0"/>
+            </w:pPr>
+            <w:r>
+              <w:rPr>
+                <w:rFonts w:ascii="Consolas" w:hAnsi="Consolas"/>
+                <w:sz w:val="17"/>
+              </w:rPr>
               <w:t>cd 9b</w:t>
             </w:r>
           </w:p>
@@ -6463,11 +7774,11 @@
       <w:pPr>
         <w:pStyle w:val="Ttulo1"/>
       </w:pPr>
-      <w:bookmarkStart w:id="24" w:name="_Toc240928941"/>
+      <w:bookmarkStart w:id="30" w:name="_Toc240929563"/>
       <w:r>
         <w:t>How AI Was Used</w:t>
       </w:r>
-      <w:bookmarkEnd w:id="24"/>
+      <w:bookmarkEnd w:id="30"/>
     </w:p>
     <w:p>
       <w:r>
@@ -6768,11 +8079,11 @@
       <w:pPr>
         <w:pStyle w:val="Ttulo2"/>
       </w:pPr>
-      <w:bookmarkStart w:id="25" w:name="_Toc240928942"/>
+      <w:bookmarkStart w:id="31" w:name="_Toc240929564"/>
       <w:r>
         <w:t>Observation on the use of AI</w:t>
       </w:r>
-      <w:bookmarkEnd w:id="25"/>
+      <w:bookmarkEnd w:id="31"/>
     </w:p>
     <w:p>
       <w:r>

</xml_diff>